<commit_message>
Update weekly research brief with revised synthesis
Regenerated report after guardrail revisions removed banned phrases
(empower, disrupt) from Organization Systems, Culture, and Leadership.

https://claude.ai/code/session_01Rt8HdzBqYxkFytGa1ihFTH
</commit_message>
<xml_diff>
--- a/Plumtree_FoW_Brief_2026-04-06.docx
+++ b/Plumtree_FoW_Brief_2026-04-06.docx
@@ -112,7 +112,7 @@
           <w:color w:val="333333"/>
           <w:sz w:val="22"/>
         </w:rPr>
-        <w:t>This week produced several substantive pieces on team dynamics, with particular focus on how AI is reshaping collaboration patterns in organizations.</w:t>
+        <w:t>This week produced several substantive pieces on team dynamics, with particular focus on how AI is reshaping collaboration patterns. The quality is solid, though the academic sources are more conceptual than immediately actionable.</w:t>
       </w:r>
     </w:p>
     <w:p>
@@ -161,7 +161,7 @@
           <w:color w:val="333333"/>
           <w:sz w:val="22"/>
         </w:rPr>
-        <w:t>https://www.deloitte.com/us/en/insights/topics/talent/building-high-performing-teams.html</w:t>
+        <w:t>January 2025</w:t>
       </w:r>
     </w:p>
     <w:p>
@@ -173,7 +173,7 @@
           <w:color w:val="333333"/>
           <w:sz w:val="22"/>
         </w:rPr>
-        <w:t>*January 2026*</w:t>
+        <w:t>https://www.deloitte.com/us/en/insights/topics/talent/building-high-performing-teams.html</w:t>
       </w:r>
     </w:p>
     <w:p>
@@ -193,7 +193,7 @@
           <w:color w:val="333333"/>
           <w:sz w:val="22"/>
         </w:rPr>
-        <w:t xml:space="preserve"> Deloitte's study of 1,394 employees identifies six human capabilities that distinguish high-performing teams: curiosity, resilience, divergent thinking, informed agility, connected teaming, and emotional and social intelligence. Counter to common assumptions, these high-performing teams actually use AI more frequently than their peers, but they deploy it strategically to enhance human strengths rather than replace human judgment. The performance gaps are substantial—high-performing teams report 93% efficiency gains versus 77% for others, with similar advantages in problem-solving and collaboration.</w:t>
+        <w:t xml:space="preserve"> Deloitte surveyed 1,394 employees and found that high-performing teams distinguish themselves through six human capabilities: curiosity, resilience, divergent thinking, informed agility, connected teaming, and emotional/social intelligence. These teams use AI more frequently than others, but crucially, they use it to amplify human strengths rather than replace human judgment. The performance gaps are substantial — high-performing teams report 93% efficiency gains versus 77% for others, with similar advantages in problem-solving and collaboration.</w:t>
       </w:r>
     </w:p>
     <w:p>
@@ -213,7 +213,7 @@
           <w:color w:val="333333"/>
           <w:sz w:val="22"/>
         </w:rPr>
-        <w:t xml:space="preserve"> Life sciences R&amp;D teams often struggle with AI adoption because they focus on the technology rather than the human capabilities needed to work effectively alongside it. This research suggests that transformation efforts should prioritize developing emotional intelligence and connected teaming skills before introducing new AI tools, as these human foundations determine whether teams can actually benefit from technological augmentation.</w:t>
+        <w:t xml:space="preserve"> Life sciences R&amp;D teams often struggle with AI adoption because they focus on the technology rather than the human capabilities needed to work effectively with it. This research provides a concrete framework for assessing whether transformation efforts are building the right foundational skills. The emphasis on emotional and social intelligence is particularly relevant given the collaborative nature of drug discovery and clinical research.</w:t>
       </w:r>
     </w:p>
     <w:p>
@@ -262,7 +262,7 @@
           <w:color w:val="333333"/>
           <w:sz w:val="22"/>
         </w:rPr>
-        <w:t>https://www.sciencedirect.com/science/article/pii/S0148296325006186</w:t>
+        <w:t>January 2025</w:t>
       </w:r>
     </w:p>
     <w:p>
@@ -274,7 +274,7 @@
           <w:color w:val="333333"/>
           <w:sz w:val="22"/>
         </w:rPr>
-        <w:t>*Date not specified in search results*</w:t>
+        <w:t>https://www.sciencedirect.com/science/article/pii/S0148296325006186</w:t>
       </w:r>
     </w:p>
     <w:p>
@@ -294,7 +294,7 @@
           <w:color w:val="333333"/>
           <w:sz w:val="22"/>
         </w:rPr>
-        <w:t xml:space="preserve"> This academic paper introduces the concept of "flubber teaming"—teams that can rapidly change their structure, hierarchy, and composition in response to project demands, much like the shape-shifting material from the movie. Digital platforms enable this fluidity by making it easier to identify, assemble, and dissolve teams based on specific skill requirements rather than traditional organizational boundaries. The research examines how large organizations are moving away from static org charts toward more dynamic, project-based team configurations.</w:t>
+        <w:t xml:space="preserve"> This academic paper introduces "flubber teaming" — teams that dynamically reconfigure their structure, hierarchy, and membership based on project needs, much like the shape-shifting material from the Disney film. Digital platforms enable this fluidity by making it easier to identify talent, form temporary teams, and dissolve them when projects end. The research suggests this model is becoming more common in large organizations that need to respond quickly to changing demands while maintaining access to specialized expertise.</w:t>
       </w:r>
     </w:p>
     <w:p>
@@ -314,7 +314,7 @@
           <w:color w:val="333333"/>
           <w:sz w:val="22"/>
         </w:rPr>
-        <w:t xml:space="preserve"> Pharmaceutical R&amp;D projects often require diverse expertise that doesn't align with traditional departmental structures—think drug discovery teams that need chemists, biologists, clinicians, and regulatory specialists working together temporarily. The flubber teaming model could help life sciences organizations form more effective cross-functional teams for specific research initiatives, then reconfigure when projects evolve or conclude.</w:t>
+        <w:t xml:space="preserve"> Pharmaceutical R&amp;D naturally operates through project-based work that spans multiple disciplines and time horizons. The flubber teaming concept could help life sciences organizations move beyond rigid departmental silos toward more responsive team structures. However, the regulatory and quality requirements in pharma may create constraints that limit how fluid these teams can actually become.</w:t>
       </w:r>
     </w:p>
     <w:p>
@@ -363,7 +363,7 @@
           <w:color w:val="333333"/>
           <w:sz w:val="22"/>
         </w:rPr>
-        <w:t>https://www.sciencedirect.com/science/article/pii/S2352250X24000502</w:t>
+        <w:t>January 2025</w:t>
       </w:r>
     </w:p>
     <w:p>
@@ -375,7 +375,7 @@
           <w:color w:val="333333"/>
           <w:sz w:val="22"/>
         </w:rPr>
-        <w:t>*Date not specified in search results*</w:t>
+        <w:t>https://www.sciencedirect.com/science/article/pii/S2352250X24000502</w:t>
       </w:r>
     </w:p>
     <w:p>
@@ -395,7 +395,7 @@
           <w:color w:val="333333"/>
           <w:sz w:val="22"/>
         </w:rPr>
-        <w:t xml:space="preserve"> Human-AI teams consistently underperform expectations because we apply traditional team science frameworks to fundamentally different collaboration scenarios. The paper argues that when one "team member" is a machine, standard approaches to role definition, communication, and shared mental models break down. Effective human-AI collaboration requires new frameworks that account for how humans and machines process information differently and how they can develop mutual understanding despite these differences.</w:t>
+        <w:t xml:space="preserve"> Human-AI teams consistently underperform expectations because we apply traditional team frameworks to fundamentally different collaboration patterns. The paper argues that effective human-AI teaming requires new approaches to role definition, communication protocols, and shared mental models. Standard team science principles assume all team members have similar cognitive architectures and social needs, which breaks down when one "member" is an algorithm.</w:t>
       </w:r>
     </w:p>
     <w:p>
@@ -415,7 +415,7 @@
           <w:color w:val="333333"/>
           <w:sz w:val="22"/>
         </w:rPr>
-        <w:t xml:space="preserve"> As life sciences organizations integrate AI into research workflows—from drug discovery algorithms to clinical trial design—they need new approaches to team formation and management. Traditional team-building exercises and communication protocols won't work when part of the team operates through APIs and algorithms rather than meetings and emails.</w:t>
+        <w:t xml:space="preserve"> Life sciences organizations are rapidly integrating AI into research workflows, but many treat it as just another tool rather than a team member requiring different collaboration approaches. This research suggests that transformation efforts need to explicitly redesign how teams operate when AI is involved, particularly in areas like drug discovery where human expertise and machine pattern recognition need to work together effectively.</w:t>
       </w:r>
     </w:p>
     <w:p/>
@@ -465,7 +465,19 @@
           <w:color w:val="333333"/>
           <w:sz w:val="22"/>
         </w:rPr>
-        <w:t>This week yielded several substantive pieces on organizational transformation in life sciences, with particularly strong coverage from McKinsey on biopharma restructuring and a relevant HBR case study on managing transformation uncertainty.</w:t>
+        <w:t>This week produced several substantial pieces on organizational transformation in life sciences, with particularly strong coverage from McKinsey on pharma-specific challenges.</w:t>
+      </w:r>
+    </w:p>
+    <w:p>
+      <w:pPr>
+        <w:jc w:val="left"/>
+      </w:pPr>
+      <w:r>
+        <w:rPr>
+          <w:color w:val="333333"/>
+          <w:sz w:val="22"/>
+        </w:rPr>
+        <w:t>---</w:t>
       </w:r>
     </w:p>
     <w:p>
@@ -490,19 +502,7 @@
           <w:color w:val="333333"/>
           <w:sz w:val="22"/>
         </w:rPr>
-        <w:t>Harvard Business Review, 2026</w:t>
-      </w:r>
-    </w:p>
-    <w:p>
-      <w:pPr>
-        <w:jc w:val="left"/>
-      </w:pPr>
-      <w:r>
-        <w:rPr>
-          <w:color w:val="333333"/>
-          <w:sz w:val="22"/>
-        </w:rPr>
-        <w:t>https://hbr.org/2026/01/how-one-company-achieved-a-bold-transformation-despite-major-unknowns</w:t>
+        <w:t>*Harvard Business Review* | [URL](https://hbr.org/2026/01/how-one-company-achieved-a-bold-transformation-despite-major-unknowns)</w:t>
       </w:r>
     </w:p>
     <w:p>
@@ -522,7 +522,7 @@
           <w:color w:val="333333"/>
           <w:sz w:val="22"/>
         </w:rPr>
-        <w:t xml:space="preserve"> This case study challenges the conventional wisdom that successful transformations require detailed upfront planning and risk mitigation. The featured company succeeded by accepting uncertainty as inevitable rather than trying to eliminate it before taking action. Leaders built adaptive capacity into their organization and used iterative learning cycles to navigate ambiguous situations. The approach emphasizes experimentation and rapid adjustment over comprehensive planning.</w:t>
+        <w:t xml:space="preserve"> This HBR case study challenges the conventional wisdom that successful transformation requires detailed upfront planning and risk elimination. Instead, it argues that leaders must build adaptive capacity and learn through action rather than analysis. The piece emphasizes that trying to resolve all uncertainties before moving forward often paralyzes organizations, while successful transformers develop comfort with ambiguity and iterate their way to solutions.</w:t>
       </w:r>
     </w:p>
     <w:p>
@@ -542,7 +542,7 @@
           <w:color w:val="333333"/>
           <w:sz w:val="22"/>
         </w:rPr>
-        <w:t xml:space="preserve"> Life sciences R&amp;D organizations face inherent uncertainty in drug development timelines, regulatory changes, and scientific breakthroughs. This case provides a practical framework for transformation leaders who must act despite incomplete information about future market conditions or technological developments. The emphasis on building adaptive capacity rather than perfect plans aligns well with the iterative nature of scientific work.</w:t>
+        <w:t xml:space="preserve"> Life sciences R&amp;D organizations face inherent uncertainty in both their science and their organizational evolution. This approach of building adaptive capacity rather than perfect plans aligns with how research teams already work—forming hypotheses, testing, and adjusting based on results. The challenge is helping R&amp;D leaders apply this same experimental mindset to organizational change rather than defaulting to over-engineered transformation plans.</w:t>
       </w:r>
     </w:p>
     <w:p>
@@ -579,19 +579,7 @@
           <w:color w:val="333333"/>
           <w:sz w:val="22"/>
         </w:rPr>
-        <w:t>McKinsey &amp; Company, 2026</w:t>
-      </w:r>
-    </w:p>
-    <w:p>
-      <w:pPr>
-        <w:jc w:val="left"/>
-      </w:pPr>
-      <w:r>
-        <w:rPr>
-          <w:color w:val="333333"/>
-          <w:sz w:val="22"/>
-        </w:rPr>
-        <w:t>https://www.mckinsey.com/industries/life-sciences/our-insights/against-the-odds-how-life-sciences-companies-excel-in-large-transformations</w:t>
+        <w:t>*McKinsey &amp; Company* | [URL](https://www.mckinsey.com/industries/life-sciences/our-insights/against-the-odds-how-life-sciences-companies-excel-in-large-transformations)</w:t>
       </w:r>
     </w:p>
     <w:p>
@@ -611,7 +599,7 @@
           <w:color w:val="333333"/>
           <w:sz w:val="22"/>
         </w:rPr>
-        <w:t xml:space="preserve"> The scale of transformation activity in pharma is remarkable—26 of the 30 largest global pharmaceutical companies have announced major transformations in the past five years. These efforts typically involve restructuring organizations, overhauling operations, and streamlining business units. The piece identifies specific factors that differentiate successful transformations from failures in the life sciences context. The high frequency of transformation attempts suggests both the urgent need for change and the difficulty of executing it effectively.</w:t>
+        <w:t xml:space="preserve"> The scale of transformation in pharma is remarkable—26 of the 30 largest global pharmaceutical companies have announced major transformations in just five years. This suggests the industry is grappling with fundamental structural challenges that require wholesale organizational redesign, not incremental fixes. The piece examines what separates successful transformations from the failures, though the specific differentiating factors aren't detailed in the search results.</w:t>
       </w:r>
     </w:p>
     <w:p>
@@ -631,7 +619,7 @@
           <w:color w:val="333333"/>
           <w:sz w:val="22"/>
         </w:rPr>
-        <w:t xml:space="preserve"> With nearly 90% of major pharma companies actively transforming, understanding what separates success from failure becomes critical for any R&amp;D transformation work. The industry-specific insights can help Plumtree clients avoid common pitfalls and adopt practices that have proven effective in similar scientific organizations. The prevalence of transformation activity also indicates that clients are likely operating in environments where multiple change initiatives may be competing for attention and resources.</w:t>
+        <w:t xml:space="preserve"> The prevalence of large-scale transformation attempts indicates that incremental change isn't sufficient for most life sciences organizations. This validates the need for comprehensive transformation approaches while highlighting the importance of understanding what actually works. For R&amp;D organizations specifically, this suggests they're likely part of broader company-wide changes rather than isolated departmental improvements.</w:t>
       </w:r>
     </w:p>
     <w:p>
@@ -668,19 +656,7 @@
           <w:color w:val="333333"/>
           <w:sz w:val="22"/>
         </w:rPr>
-        <w:t>McKinsey &amp; Company, 2026</w:t>
-      </w:r>
-    </w:p>
-    <w:p>
-      <w:pPr>
-        <w:jc w:val="left"/>
-      </w:pPr>
-      <w:r>
-        <w:rPr>
-          <w:color w:val="333333"/>
-          <w:sz w:val="22"/>
-        </w:rPr>
-        <w:t>https://www.mckinsey.com/industries/life-sciences/our-insights/simplification-for-success-rewiring-the-biopharma-operating-model</w:t>
+        <w:t>*McKinsey &amp; Company* | [URL](https://www.mckinsey.com/industries/life-sciences/our-insights/simplification-for-success-rewiring-the-biopharma-operating-model)</w:t>
       </w:r>
     </w:p>
     <w:p>
@@ -700,7 +676,7 @@
           <w:color w:val="333333"/>
           <w:sz w:val="22"/>
         </w:rPr>
-        <w:t xml:space="preserve"> Some biopharma companies are achieving significant improvements by eliminating organizational duplication between global, regional, and local layers. One example company consolidated from multiple regions to just two—international and US—using an "above-market vs. in-market" structure. This approach brought decision-making closer to customers, reduced bureaucratic overhead, and gave employees clearer role definitions. The simplification strategy directly addresses the complexity that often slows down pharmaceutical organizations.</w:t>
+        <w:t xml:space="preserve"> Some biopharma companies are achieving significant improvements by eliminating organizational layers rather than adding them. One example consolidated from multiple regional structures to just two regions (international and US), using an "above-market vs. in-market" framework. This brought decision-making closer to customers, reduced bureaucratic overhead, and clarified employee roles—demonstrating that structural simplification can solve multiple organizational problems simultaneously.</w:t>
       </w:r>
     </w:p>
     <w:p>
@@ -720,7 +696,7 @@
           <w:color w:val="333333"/>
           <w:sz w:val="22"/>
         </w:rPr>
-        <w:t xml:space="preserve"> Many life sciences R&amp;D organizations struggle with matrix structures and unclear decision rights that slow scientific progress. This concrete example of successful simplification provides a template for reducing organizational complexity without losing necessary coordination. The focus on bringing decisions closer to the work—in this case, customers—parallels the need to bring R&amp;D decisions closer to the scientists doing the actual research.</w:t>
+        <w:t xml:space="preserve"> R&amp;D organizations often suffer from similar layering problems, with matrix structures that create unclear accountability and slow decision-making. The principle of bringing decisions closer to the actual work (analogous to bringing decisions closer to customers) could mean giving research teams more authority and reducing the number of approval layers for scientific decisions. This structural approach addresses the human element by giving people clearer roles and more direct impact.</w:t>
       </w:r>
     </w:p>
     <w:p>
@@ -757,19 +733,7 @@
           <w:color w:val="333333"/>
           <w:sz w:val="22"/>
         </w:rPr>
-        <w:t>Deloitte Insights, 2026</w:t>
-      </w:r>
-    </w:p>
-    <w:p>
-      <w:pPr>
-        <w:jc w:val="left"/>
-      </w:pPr>
-      <w:r>
-        <w:rPr>
-          <w:color w:val="333333"/>
-          <w:sz w:val="22"/>
-        </w:rPr>
-        <w:t>https://www.deloitte.com/us/en/insights/industry/health-care/life-sciences-and-health-care-industry-outlooks/2026-life-sciences-executive-outlook.html</w:t>
+        <w:t>*Deloitte Insights* | [URL](https://www.deloitte.com/us/en/insights/industry/health-care/life-sciences-and-health-care-industry-outlooks/2026-life-sciences-executive-outlook.html)</w:t>
       </w:r>
     </w:p>
     <w:p>
@@ -789,7 +753,7 @@
           <w:color w:val="333333"/>
           <w:sz w:val="22"/>
         </w:rPr>
-        <w:t xml:space="preserve"> Digital transformation has become a top priority, with 48% of life sciences leaders identifying it as having substantial impact in 2026—a significant increase from 2025. However, there's a notable gap between ambition and execution: only 22% have successfully scaled AI initiatives, and just 9% report achieving significant returns from AI investments. Despite transformation challenges, 75% of biopharma and medtech executives remain confident about their organizations' financial outlook, though only 41% are optimistic about the broader economy.</w:t>
+        <w:t xml:space="preserve"> Despite heavy investment in digital transformation and AI, actual results remain limited—only 22% of life sciences companies have successfully scaled AI, and just 9% report significant returns. This gap between investment and results suggests that the technical implementation of new tools isn't the primary challenge. The data indicates that organizational and human factors may be the real barriers to realizing value from digital initiatives.</w:t>
       </w:r>
     </w:p>
     <w:p>
@@ -809,7 +773,7 @@
           <w:color w:val="333333"/>
           <w:sz w:val="22"/>
         </w:rPr>
-        <w:t xml:space="preserve"> The data reveals a classic transformation challenge—high executive enthusiasm for digital change coupled with low success rates in implementation. This gap suggests that life sciences organizations need better approaches to scaling new technologies and measuring their impact. The disconnect between confidence in digital transformation and actual results indicates opportunities for more effective change management approaches in R&amp;D settings.</w:t>
+        <w:t xml:space="preserve"> The low success rates for AI scaling in life sciences highlight that technology adoption is fundamentally an organizational challenge, not a technical one. R&amp;D organizations investing in AI and digital tools need to focus as much on how people work with these technologies as on the technologies themselves. This reinforces the importance of human-centric transformation approaches that address workflow, culture, and capability building alongside technical implementation.</w:t>
       </w:r>
     </w:p>
     <w:p/>
@@ -928,7 +892,7 @@
           <w:color w:val="333333"/>
           <w:sz w:val="22"/>
         </w:rPr>
-        <w:t xml:space="preserve"> Rather than attempting broad cultural overhauls, effective change starts by identifying a single behavior that creates ripple effects throughout the organization. The piece argues that behavior drives culture more than values statements or leadership speeches. When leaders focus on one specific, observable action and consistently model it, that behavior spreads organically and shifts underlying cultural patterns. This approach works because it gives people something concrete to practice rather than abstract concepts to embrace.</w:t>
+        <w:t xml:space="preserve"> The article argues that effective culture change starts by identifying and shifting a single high-impact behavior rather than attempting broad transformation. This behavior should cascade naturally through the organization, creating ripple effects that influence other practices and norms. The approach recognizes that behavior drives culture more than mission statements or values exercises, making change more tangible and measurable.</w:t>
       </w:r>
     </w:p>
     <w:p>
@@ -948,7 +912,7 @@
           <w:color w:val="333333"/>
           <w:sz w:val="22"/>
         </w:rPr>
-        <w:t xml:space="preserve"> This directly supports our human-centric approach to R&amp;D transformation. Scientists respond better to specific behavioral changes they can observe and practice than to broad cultural mandates. For example, changing how research teams share preliminary findings or how they handle failed experiments can cascade into broader shifts toward collaboration and learning. This behavioral focus aligns with how scientists naturally think—through observable, measurable changes rather than aspirational frameworks.</w:t>
+        <w:t xml:space="preserve"> This directly supports our human-centric approach to R&amp;D transformation. Instead of launching sweeping culture initiatives, we can help clients identify specific behaviors that matter most in their research environment—perhaps how teams share negative results or how they collaborate across therapeutic areas. This behavioral focus gives scientists concrete actions to practice rather than abstract cultural concepts to embrace.</w:t>
       </w:r>
     </w:p>
     <w:p>
@@ -1017,7 +981,7 @@
           <w:color w:val="333333"/>
           <w:sz w:val="22"/>
         </w:rPr>
-        <w:t xml:space="preserve"> High-agency cultures enable people to act effectively despite uncertainty by helping them choose beliefs that expand their perception of what's possible. The article contrasts this with blame-oriented cultures where people feel helpless when facing ambiguous challenges. Leaders build agency by encouraging experimentation, reframing setbacks as learning opportunities, and helping teams focus on what they can control rather than external constraints. The framework emphasizes that agency is learnable and can be systematically developed across organizations.</w:t>
+        <w:t xml:space="preserve"> The piece defines "high agency" as the capacity to act despite ambiguity by choosing beliefs that expand what people notice, expect, and attempt. Leaders can deliberately cultivate this mindset to replace cultures of blame and helplessness with ones oriented toward experimentation and problem-solving. The framework provides practical steps for building agency rather than just describing its benefits.</w:t>
       </w:r>
     </w:p>
     <w:p>
@@ -1037,7 +1001,7 @@
           <w:color w:val="333333"/>
           <w:sz w:val="22"/>
         </w:rPr>
-        <w:t xml:space="preserve"> R&amp;D environments are inherently uncertain, making high agency essential for scientific innovation. Many life sciences organizations struggle with risk-averse cultures that punish failure, which directly undermines the experimental mindset needed for breakthrough research. This framework offers practical tools for helping research teams maintain momentum when facing regulatory hurdles, failed trials, or unclear market signals—common challenges that can paralyze R&amp;D organizations if not handled well.</w:t>
+        <w:t xml:space="preserve"> High agency is essential in R&amp;D environments where uncertainty is constant and breakthrough discoveries require people to act before all the data is in. This framework could help our clients move away from risk-averse cultures that punish failure toward ones that reward intelligent experimentation. For scientists and doctors, this means creating conditions where they feel confident to pursue promising but uncertain research directions.</w:t>
       </w:r>
     </w:p>
     <w:p>
@@ -1106,7 +1070,7 @@
           <w:color w:val="333333"/>
           <w:sz w:val="22"/>
         </w:rPr>
-        <w:t xml:space="preserve"> Life sciences companies are exploring how AI agents can accelerate R&amp;D processes while researchers remain central to innovation work. The piece examines how organizations are building cultures that integrate AI agents as collaborative tools rather than replacements for human expertise. Success requires rethinking decision-making processes, trust in data, and how teams coordinate when some members are AI systems. The cultural challenge isn't technical adoption but creating new norms for human-AI collaboration.</w:t>
+        <w:t xml:space="preserve"> Life sciences and pharma companies are beginning to envision AI agents working alongside researchers in R&amp;D, with the goal of accelerating innovation rather than replacing human scientists. The integration requires building cultures that can effectively blend human judgment with AI capabilities. Organizations must rethink how decisions get made and how trust operates when AI agents become active participants in research processes.</w:t>
       </w:r>
     </w:p>
     <w:p>
@@ -1126,7 +1090,324 @@
           <w:color w:val="333333"/>
           <w:sz w:val="22"/>
         </w:rPr>
-        <w:t xml:space="preserve"> This speaks directly to current transformation challenges in life sciences R&amp;D, where AI adoption often stalls due to cultural resistance rather than technical limitations. Scientists need new ways of working that preserve their expertise while incorporating AI capabilities. The cultural integration challenge—helping research teams develop trust in AI-generated insights while maintaining scientific rigor—is exactly the type of human-centric transformation work our clients face as they modernize their R&amp;D processes.</w:t>
+        <w:t xml:space="preserve"> This speaks directly to a challenge many of our life sciences clients face: how to integrate AI tools without undermining the collaborative relationships that drive good science. The cultural implications go beyond technology adoption to fundamental questions about how research teams work together. Our transformation work needs to address both the human dynamics and the new workflows that emerge when AI becomes a research partner rather than just a tool.</w:t>
+      </w:r>
+    </w:p>
+    <w:p/>
+    <w:p>
+      <w:pPr>
+        <w:jc w:val="left"/>
+      </w:pPr>
+      <w:r>
+        <w:rPr>
+          <w:b/>
+          <w:color w:val="6B2D8B"/>
+          <w:sz w:val="32"/>
+        </w:rPr>
+        <w:t>4. LEADERSHIP</w:t>
+      </w:r>
+    </w:p>
+    <w:p>
+      <w:pPr>
+        <w:jc w:val="left"/>
+      </w:pPr>
+      <w:r>
+        <w:rPr>
+          <w:color w:val="6B2D8B"/>
+          <w:sz w:val="12"/>
+        </w:rPr>
+        <w:t>────────────────────────────────────────────────────────────────────────────────</w:t>
+      </w:r>
+    </w:p>
+    <w:p>
+      <w:pPr>
+        <w:jc w:val="left"/>
+      </w:pPr>
+      <w:r>
+        <w:rPr>
+          <w:color w:val="333333"/>
+          <w:sz w:val="22"/>
+        </w:rPr>
+        <w:t>## Leadership Research Brief - Week of [Current Date]</w:t>
+      </w:r>
+    </w:p>
+    <w:p>
+      <w:pPr>
+        <w:jc w:val="left"/>
+      </w:pPr>
+      <w:r>
+        <w:rPr>
+          <w:color w:val="333333"/>
+          <w:sz w:val="22"/>
+        </w:rPr>
+        <w:t>This week's search results offer some substantive insights, though the selection is relatively thin. Three articles from reputable sources provide useful perspectives on leadership challenges, while one appears to be from a future date and should be disregarded.</w:t>
+      </w:r>
+    </w:p>
+    <w:p>
+      <w:pPr>
+        <w:jc w:val="left"/>
+      </w:pPr>
+      <w:r>
+        <w:rPr>
+          <w:color w:val="333333"/>
+          <w:sz w:val="22"/>
+        </w:rPr>
+        <w:t>---</w:t>
+      </w:r>
+    </w:p>
+    <w:p>
+      <w:pPr>
+        <w:jc w:val="left"/>
+      </w:pPr>
+      <w:r>
+        <w:rPr>
+          <w:b/>
+          <w:color w:val="333333"/>
+          <w:sz w:val="22"/>
+        </w:rPr>
+        <w:t>The art of 21st-century leadership: From succession planning to building a leadership factory</w:t>
+      </w:r>
+    </w:p>
+    <w:p>
+      <w:pPr>
+        <w:jc w:val="left"/>
+      </w:pPr>
+      <w:r>
+        <w:rPr>
+          <w:color w:val="333333"/>
+          <w:sz w:val="22"/>
+        </w:rPr>
+        <w:t>McKinsey &amp; Company</w:t>
+      </w:r>
+    </w:p>
+    <w:p>
+      <w:pPr>
+        <w:jc w:val="left"/>
+      </w:pPr>
+      <w:r>
+        <w:rPr>
+          <w:color w:val="333333"/>
+          <w:sz w:val="22"/>
+        </w:rPr>
+        <w:t>[https://www.mckinsey.com/capabilities/strategy-and-corporate-finance/our-insights/the-art-of-21st-century-leadership-from-succession-planning-to-building-a-leadership-factory](https://www.mckinsey.com/capabilities/strategy-and-corporate-finance/our-insights/the-art-of-21st-century-leadership-from-succession-planning-to-building-a-leadership-factory)</w:t>
+      </w:r>
+    </w:p>
+    <w:p>
+      <w:pPr>
+        <w:jc w:val="left"/>
+      </w:pPr>
+      <w:r>
+        <w:rPr>
+          <w:b/>
+          <w:color w:val="333333"/>
+          <w:sz w:val="22"/>
+        </w:rPr>
+        <w:t>Key insights:</w:t>
+      </w:r>
+      <w:r>
+        <w:rPr>
+          <w:color w:val="333333"/>
+          <w:sz w:val="22"/>
+        </w:rPr>
+        <w:t xml:space="preserve"> CEOs consistently identify talent and leadership team capabilities as their biggest operational hurdles. The traditional approach of succession planning—identifying and grooming individual replacements—is insufficient for today's pace of change. Instead, organizations need systematic approaches to continuously develop leadership capabilities across multiple levels, creating what the authors call a "leadership factory" that can adapt to both current challenges and future uncertainties.</w:t>
+      </w:r>
+    </w:p>
+    <w:p>
+      <w:pPr>
+        <w:jc w:val="left"/>
+      </w:pPr>
+      <w:r>
+        <w:rPr>
+          <w:b/>
+          <w:color w:val="333333"/>
+          <w:sz w:val="22"/>
+        </w:rPr>
+        <w:t>Relevance to Plumtree:</w:t>
+      </w:r>
+      <w:r>
+        <w:rPr>
+          <w:color w:val="333333"/>
+          <w:sz w:val="22"/>
+        </w:rPr>
+        <w:t xml:space="preserve"> Life sciences R&amp;D organizations face particularly acute leadership challenges given the technical complexity of their work and the long timelines of drug development. The "leadership factory" concept applies directly to building scientific leadership capabilities that can navigate both technical decisions and organizational transformation. This systematic approach to leadership development could help R&amp;D organizations avoid the common trap of promoting excellent scientists into leadership roles without adequate preparation.</w:t>
+      </w:r>
+    </w:p>
+    <w:p>
+      <w:pPr>
+        <w:jc w:val="left"/>
+      </w:pPr>
+      <w:r>
+        <w:rPr>
+          <w:color w:val="333333"/>
+          <w:sz w:val="22"/>
+        </w:rPr>
+        <w:t>---</w:t>
+      </w:r>
+    </w:p>
+    <w:p>
+      <w:pPr>
+        <w:jc w:val="left"/>
+      </w:pPr>
+      <w:r>
+        <w:rPr>
+          <w:b/>
+          <w:color w:val="333333"/>
+          <w:sz w:val="22"/>
+        </w:rPr>
+        <w:t>How Leaders Face the Future of Work</w:t>
+      </w:r>
+    </w:p>
+    <w:p>
+      <w:pPr>
+        <w:jc w:val="left"/>
+      </w:pPr>
+      <w:r>
+        <w:rPr>
+          <w:color w:val="333333"/>
+          <w:sz w:val="22"/>
+        </w:rPr>
+        <w:t>Lynda Gratton, MIT Sloan Management Review</w:t>
+      </w:r>
+    </w:p>
+    <w:p>
+      <w:pPr>
+        <w:jc w:val="left"/>
+      </w:pPr>
+      <w:r>
+        <w:rPr>
+          <w:color w:val="333333"/>
+          <w:sz w:val="22"/>
+        </w:rPr>
+        <w:t>[https://sloanreview.mit.edu/article/how-leaders-face-the-future-of-work/](https://sloanreview.mit.edu/article/how-leaders-face-the-future-of-work/)</w:t>
+      </w:r>
+    </w:p>
+    <w:p>
+      <w:pPr>
+        <w:jc w:val="left"/>
+      </w:pPr>
+      <w:r>
+        <w:rPr>
+          <w:b/>
+          <w:color w:val="333333"/>
+          <w:sz w:val="22"/>
+        </w:rPr>
+        <w:t>Key insights:</w:t>
+      </w:r>
+      <w:r>
+        <w:rPr>
+          <w:color w:val="333333"/>
+          <w:sz w:val="22"/>
+        </w:rPr>
+        <w:t xml:space="preserve"> Leaders must treat decision-making as a strategic discipline rather than an ad hoc process. The integration of AI into work requires intentional design of how humans and machines share judgment and accountability. Maintaining trust and protecting human agency becomes critical as AI takes on more decision-support roles. The article emphasizes that successful leaders actively design these human-AI partnerships rather than letting them evolve organically.</w:t>
+      </w:r>
+    </w:p>
+    <w:p>
+      <w:pPr>
+        <w:jc w:val="left"/>
+      </w:pPr>
+      <w:r>
+        <w:rPr>
+          <w:b/>
+          <w:color w:val="333333"/>
+          <w:sz w:val="22"/>
+        </w:rPr>
+        <w:t>Relevance to Plumtree:</w:t>
+      </w:r>
+      <w:r>
+        <w:rPr>
+          <w:color w:val="333333"/>
+          <w:sz w:val="22"/>
+        </w:rPr>
+        <w:t xml:space="preserve"> In R&amp;D environments where scientific judgment is paramount, the question of how AI supports versus replaces human decision-making is particularly sensitive. Scientists and doctors need frameworks for maintaining their professional judgment while benefiting from AI capabilities. This applies directly to transformation work that involves implementing new technologies while preserving the scientific rigor and human expertise that drives innovation.</w:t>
+      </w:r>
+    </w:p>
+    <w:p>
+      <w:pPr>
+        <w:jc w:val="left"/>
+      </w:pPr>
+      <w:r>
+        <w:rPr>
+          <w:color w:val="333333"/>
+          <w:sz w:val="22"/>
+        </w:rPr>
+        <w:t>---</w:t>
+      </w:r>
+    </w:p>
+    <w:p>
+      <w:pPr>
+        <w:jc w:val="left"/>
+      </w:pPr>
+      <w:r>
+        <w:rPr>
+          <w:b/>
+          <w:color w:val="333333"/>
+          <w:sz w:val="22"/>
+        </w:rPr>
+        <w:t>Why Digital Dexterity Is Key to Transformation</w:t>
+      </w:r>
+    </w:p>
+    <w:p>
+      <w:pPr>
+        <w:jc w:val="left"/>
+      </w:pPr>
+      <w:r>
+        <w:rPr>
+          <w:color w:val="333333"/>
+          <w:sz w:val="22"/>
+        </w:rPr>
+        <w:t>MIT Sloan Management Review</w:t>
+      </w:r>
+    </w:p>
+    <w:p>
+      <w:pPr>
+        <w:jc w:val="left"/>
+      </w:pPr>
+      <w:r>
+        <w:rPr>
+          <w:color w:val="333333"/>
+          <w:sz w:val="22"/>
+        </w:rPr>
+        <w:t>[https://sloanreview.mit.edu/article/why-digital-dexterity-is-key-to-transformation/](https://sloanreview.mit.edu/article/why-digital-dexterity-is-key-to-transformation/)</w:t>
+      </w:r>
+    </w:p>
+    <w:p>
+      <w:pPr>
+        <w:jc w:val="left"/>
+      </w:pPr>
+      <w:r>
+        <w:rPr>
+          <w:b/>
+          <w:color w:val="333333"/>
+          <w:sz w:val="22"/>
+        </w:rPr>
+        <w:t>Key insights:</w:t>
+      </w:r>
+      <w:r>
+        <w:rPr>
+          <w:color w:val="333333"/>
+          <w:sz w:val="22"/>
+        </w:rPr>
+        <w:t xml:space="preserve"> Digital dexterity combines both willingness and ability to use new technologies effectively. Organizations need to integrate learning directly into daily work processes rather than treating it as separate training events. The concept of "learning organizations" is evolving to mean places where skill development happens continuously through work itself, particularly as generative AI and other technologies require ongoing adaptation rather than one-time implementation.</w:t>
+      </w:r>
+    </w:p>
+    <w:p>
+      <w:pPr>
+        <w:jc w:val="left"/>
+      </w:pPr>
+      <w:r>
+        <w:rPr>
+          <w:b/>
+          <w:color w:val="333333"/>
+          <w:sz w:val="22"/>
+        </w:rPr>
+        <w:t>Relevance to Plumtree:</w:t>
+      </w:r>
+      <w:r>
+        <w:rPr>
+          <w:color w:val="333333"/>
+          <w:sz w:val="22"/>
+        </w:rPr>
+        <w:t xml:space="preserve"> R&amp;D scientists often have high technical ability but may resist new digital tools that seem to interfere with established research processes. The emphasis on integrating learning into daily work aligns well with how scientists naturally learn—through experimentation and iteration. This approach could help R&amp;D organizations adopt new technologies without interfering with the fundamental scientific methods that drive their success.</w:t>
       </w:r>
     </w:p>
     <w:p>
@@ -1158,7 +1439,7 @@
           <w:color w:val="333333"/>
           <w:sz w:val="22"/>
         </w:rPr>
-        <w:t xml:space="preserve"> The Deloitte Global Human Capital Trends report was mentioned in search results but appears to contain primarily high-level observations about human-machine collaboration without sufficient depth for inclusion in this brief.</w:t>
+        <w:t xml:space="preserve"> The first search result appears to be dated February 2026, which suggests it may be speculative content or incorrectly dated. I've excluded it from this analysis to maintain reliability.</w:t>
       </w:r>
     </w:p>
     <w:p/>
@@ -1172,7 +1453,7 @@
           <w:color w:val="6B2D8B"/>
           <w:sz w:val="32"/>
         </w:rPr>
-        <w:t>4. LEADERSHIP</w:t>
+        <w:t>5. AI AND THE FUTURE OF WORK</w:t>
       </w:r>
     </w:p>
     <w:p>
@@ -1196,7 +1477,7 @@
           <w:color w:val="333333"/>
           <w:sz w:val="22"/>
         </w:rPr>
-        <w:t>## Leadership Research Brief - Week of [Date]</w:t>
+        <w:t>## AI and the Future of Work - Weekly Research Brief</w:t>
       </w:r>
     </w:p>
     <w:p>
@@ -1208,7 +1489,7 @@
           <w:color w:val="333333"/>
           <w:sz w:val="22"/>
         </w:rPr>
-        <w:t>This week's leadership research offers mixed quality. While we have some substantive pieces from reputable sources, the overall selection is lighter than ideal, with several articles leaning toward trend-focused content rather than deep insights.</w:t>
+        <w:t>This week's search results focus heavily on AI applications in life sciences, with three substantive pieces examining the current state and future potential of AI in pharmaceutical R&amp;D.</w:t>
       </w:r>
     </w:p>
     <w:p>
@@ -1233,7 +1514,7 @@
           <w:color w:val="333333"/>
           <w:sz w:val="22"/>
         </w:rPr>
-        <w:t>How Leaders Face the Future of Work</w:t>
+        <w:t>The future of pharmaceuticals: Artificial intelligence in drug discovery and development</w:t>
       </w:r>
     </w:p>
     <w:p>
@@ -1245,7 +1526,7 @@
           <w:color w:val="333333"/>
           <w:sz w:val="22"/>
         </w:rPr>
-        <w:t>*Author: Lynda Gratton*</w:t>
+        <w:t>*Author not specified*</w:t>
       </w:r>
     </w:p>
     <w:p>
@@ -1257,7 +1538,7 @@
           <w:color w:val="333333"/>
           <w:sz w:val="22"/>
         </w:rPr>
-        <w:t>*MIT Sloan Management Review, [Date]*</w:t>
+        <w:t>ScienceDirect, 2025</w:t>
       </w:r>
     </w:p>
     <w:p>
@@ -1269,7 +1550,7 @@
           <w:color w:val="333333"/>
           <w:sz w:val="22"/>
         </w:rPr>
-        <w:t>*Source: https://sloanreview.mit.edu/article/how-leaders-face-the-future-of-work/*</w:t>
+        <w:t>https://www.sciencedirect.com/science/article/pii/S2095177925000656</w:t>
       </w:r>
     </w:p>
     <w:p>
@@ -1289,7 +1570,7 @@
           <w:color w:val="333333"/>
           <w:sz w:val="22"/>
         </w:rPr>
-        <w:t xml:space="preserve"> Gratton argues that leaders must treat decision-making as a strategic discipline rather than an ad-hoc process. The piece emphasizes the critical need to intentionally design how humans and AI share judgment and accountability, particularly as AI capabilities expand. The focus is on maintaining trust and protecting human agency while integrating new technologies into decision-making processes.</w:t>
+        <w:t xml:space="preserve"> This academic review examines how AI, machine learning, and deep learning are transforming traditional drug discovery models. The authors document specific advances in drug characterization, target discovery, small molecule design, and clinical trial processes. The paper emphasizes measurable improvements in efficiency, accuracy, and success rates while reducing both timelines and costs. The focus is on concrete applications rather than theoretical potential.</w:t>
       </w:r>
     </w:p>
     <w:p>
@@ -1309,7 +1590,7 @@
           <w:color w:val="333333"/>
           <w:sz w:val="22"/>
         </w:rPr>
-        <w:t xml:space="preserve"> This directly applies to R&amp;D transformation work where scientists and doctors are increasingly working alongside AI tools for research design, data analysis, and clinical decision-making. The emphasis on intentional design of human-AI collaboration is particularly relevant for life sciences organizations navigating how to integrate AI while preserving the critical thinking and judgment that drives scientific innovation.</w:t>
+        <w:t xml:space="preserve"> Life sciences R&amp;D organizations are implementing these AI tools now, not in some distant future. This creates immediate transformation challenges around workflow integration, skill development, and change management. Teams need support navigating how these technologies actually change daily research practices and collaboration patterns.</w:t>
       </w:r>
     </w:p>
     <w:p>
@@ -1334,7 +1615,7 @@
           <w:color w:val="333333"/>
           <w:sz w:val="22"/>
         </w:rPr>
-        <w:t>Why Digital Dexterity Is Key to Transformation</w:t>
+        <w:t>Generative AI in the pharmaceutical industry: Moving from hype to reality</w:t>
       </w:r>
     </w:p>
     <w:p>
@@ -1346,7 +1627,7 @@
           <w:color w:val="333333"/>
           <w:sz w:val="22"/>
         </w:rPr>
-        <w:t>*Author: [Not specified in search results]*</w:t>
+        <w:t>*Author not specified*</w:t>
       </w:r>
     </w:p>
     <w:p>
@@ -1358,7 +1639,7 @@
           <w:color w:val="333333"/>
           <w:sz w:val="22"/>
         </w:rPr>
-        <w:t>*MIT Sloan Management Review, [Date]*</w:t>
+        <w:t>McKinsey &amp; Company, 2025</w:t>
       </w:r>
     </w:p>
     <w:p>
@@ -1370,7 +1651,7 @@
           <w:color w:val="333333"/>
           <w:sz w:val="22"/>
         </w:rPr>
-        <w:t>*Source: https://sloanreview.mit.edu/article/why-digital-dexterity-is-key-to-transformation/*</w:t>
+        <w:t>https://www.mckinsey.com/industries/life-sciences/our-insights/generative-ai-in-the-pharmaceutical-industry-moving-from-hype-to-reality</w:t>
       </w:r>
     </w:p>
     <w:p>
@@ -1390,7 +1671,7 @@
           <w:color w:val="333333"/>
           <w:sz w:val="22"/>
         </w:rPr>
-        <w:t xml:space="preserve"> The article introduces the concept of "digital dexterity" - the combination of willingness and ability to adopt new technologies like generative AI for innovative solutions. It argues that learning must be integrated into daily work processes rather than treated as separate training events. This approach is positioned as essential for creating true learning organizations that can adapt to technological change.</w:t>
+        <w:t xml:space="preserve"> McKinsey estimates generative AI could create $5-7 billion in value for life sciences, with pharma R&amp;D representing 30-40% of that potential. The report emphasizes the industry is moving from experimentation to "purposeful transformation" where organizations must balance innovation with operational discipline. The piece suggests companies are now focusing on strategic implementation rather than proof-of-concept projects.</w:t>
       </w:r>
     </w:p>
     <w:p>
@@ -1410,7 +1691,7 @@
           <w:color w:val="333333"/>
           <w:sz w:val="22"/>
         </w:rPr>
-        <w:t xml:space="preserve"> R&amp;D organizations face constant pressure to adopt new digital tools and methodologies, from AI-assisted drug discovery to advanced data analytics platforms. The concept of embedding learning into daily work aligns well with how scientists naturally operate - through experimentation and iteration - and could inform how transformation initiatives are designed to feel more natural to research teams.</w:t>
+        <w:t xml:space="preserve"> The shift from hype to strategic implementation means R&amp;D organizations need structured approaches to AI adoption. This isn't about technology deployment—it's about helping scientific teams understand how their work changes and ensuring transformation efforts focus on actual value creation rather than following trends.</w:t>
       </w:r>
     </w:p>
     <w:p>
@@ -1435,89 +1716,7 @@
           <w:color w:val="333333"/>
           <w:sz w:val="22"/>
         </w:rPr>
-        <w:t>Note on remaining sources:</w:t>
-      </w:r>
-      <w:r>
-        <w:rPr>
-          <w:color w:val="333333"/>
-          <w:sz w:val="22"/>
-        </w:rPr>
-        <w:t xml:space="preserve"> The Harvard Business Review piece on 2026 trends and the McKinsey article on "leadership factories" both lean heavily toward trend forecasting and corporate buzzwords rather than substantive insights. While they come from reputable sources, they offer more speculation than actionable research for transformation practitioners.</w:t>
-      </w:r>
-    </w:p>
-    <w:p/>
-    <w:p>
-      <w:pPr>
-        <w:jc w:val="left"/>
-      </w:pPr>
-      <w:r>
-        <w:rPr>
-          <w:b/>
-          <w:color w:val="6B2D8B"/>
-          <w:sz w:val="32"/>
-        </w:rPr>
-        <w:t>5. AI AND THE FUTURE OF WORK</w:t>
-      </w:r>
-    </w:p>
-    <w:p>
-      <w:pPr>
-        <w:jc w:val="left"/>
-      </w:pPr>
-      <w:r>
-        <w:rPr>
-          <w:color w:val="6B2D8B"/>
-          <w:sz w:val="12"/>
-        </w:rPr>
-        <w:t>────────────────────────────────────────────────────────────────────────────────</w:t>
-      </w:r>
-    </w:p>
-    <w:p>
-      <w:pPr>
-        <w:jc w:val="left"/>
-      </w:pPr>
-      <w:r>
-        <w:rPr>
-          <w:color w:val="333333"/>
-          <w:sz w:val="22"/>
-        </w:rPr>
-        <w:t>## AI and the Future of Work - Weekly Research Brief</w:t>
-      </w:r>
-    </w:p>
-    <w:p>
-      <w:pPr>
-        <w:jc w:val="left"/>
-      </w:pPr>
-      <w:r>
-        <w:rPr>
-          <w:color w:val="333333"/>
-          <w:sz w:val="22"/>
-        </w:rPr>
-        <w:t>This week's search results focus heavily on AI applications in pharmaceutical R&amp;D, with limited broader "future of work" content. The quality is mixed - two substantial industry reports and one academic paper, plus one generic McKinsey piece.</w:t>
-      </w:r>
-    </w:p>
-    <w:p>
-      <w:pPr>
-        <w:jc w:val="left"/>
-      </w:pPr>
-      <w:r>
-        <w:rPr>
-          <w:color w:val="333333"/>
-          <w:sz w:val="22"/>
-        </w:rPr>
-        <w:t>### Selected Articles</w:t>
-      </w:r>
-    </w:p>
-    <w:p>
-      <w:pPr>
-        <w:jc w:val="left"/>
-      </w:pPr>
-      <w:r>
-        <w:rPr>
-          <w:b/>
-          <w:color w:val="333333"/>
-          <w:sz w:val="22"/>
-        </w:rPr>
-        <w:t>The future of pharmaceuticals: Artificial intelligence in drug discovery and development</w:t>
+        <w:t>Generative AI to Reshape the Future of Life Sciences</w:t>
       </w:r>
     </w:p>
     <w:p>
@@ -1541,7 +1740,7 @@
           <w:color w:val="333333"/>
           <w:sz w:val="22"/>
         </w:rPr>
-        <w:t>ScienceDirect, 2025</w:t>
+        <w:t>Deloitte, 2025</w:t>
       </w:r>
     </w:p>
     <w:p>
@@ -1553,7 +1752,7 @@
           <w:color w:val="333333"/>
           <w:sz w:val="22"/>
         </w:rPr>
-        <w:t>https://www.sciencedirect.com/science/article/pii/S2095177925000656</w:t>
+        <w:t>https://www.deloitte.com/us/en/Industries/life-sciences-health-care/articles/value-of-genai-in-pharma.html</w:t>
       </w:r>
     </w:p>
     <w:p>
@@ -1573,7 +1772,7 @@
           <w:color w:val="333333"/>
           <w:sz w:val="22"/>
         </w:rPr>
-        <w:t xml:space="preserve"> This academic review examines how AI, machine learning, and deep learning are changing drug discovery workflows. The paper documents specific advances in drug characterization, target identification, small molecule design, and clinical trial processes. The authors argue that AI is moving beyond efficiency gains to fundamentally alter how pharmaceutical research is conducted, with measurable improvements in success rates and timeline compression.</w:t>
+        <w:t xml:space="preserve"> Despite widespread enthusiasm (30% of leaders cite agentic AI as a key 2026 trend), actual implementation lags significantly—only 22% of organizations have scaled AI initiatives and just 9% report significant returns. The report highlights a gap between executive expectations and operational reality. The industry is beginning to focus on measurable productivity gains rather than experimental applications.</w:t>
       </w:r>
     </w:p>
     <w:p>
@@ -1593,7 +1792,7 @@
           <w:color w:val="333333"/>
           <w:sz w:val="22"/>
         </w:rPr>
-        <w:t xml:space="preserve"> Life sciences R&amp;D teams are grappling with how to integrate these AI capabilities into existing research workflows without breaking productive collaborations. The technical advances described here will require significant organizational change management as scientists adapt their daily practices and decision-making processes.</w:t>
+        <w:t xml:space="preserve"> The implementation gap reveals a classic transformation challenge: organizations know they need to adopt AI but struggle with execution. This suggests R&amp;D teams need support with practical implementation strategies, realistic timeline setting, and measuring actual impact rather than pursuing AI initiatives for their own sake.</w:t>
       </w:r>
     </w:p>
     <w:p>
@@ -1618,220 +1817,14 @@
           <w:color w:val="333333"/>
           <w:sz w:val="22"/>
         </w:rPr>
-        <w:t>Generative AI in the pharmaceutical industry: Moving from hype to reality</w:t>
-      </w:r>
-    </w:p>
-    <w:p>
-      <w:pPr>
-        <w:jc w:val="left"/>
-      </w:pPr>
-      <w:r>
-        <w:rPr>
-          <w:color w:val="333333"/>
-          <w:sz w:val="22"/>
-        </w:rPr>
-        <w:t>*Author not specified*</w:t>
-      </w:r>
-    </w:p>
-    <w:p>
-      <w:pPr>
-        <w:jc w:val="left"/>
-      </w:pPr>
-      <w:r>
-        <w:rPr>
-          <w:color w:val="333333"/>
-          <w:sz w:val="22"/>
-        </w:rPr>
-        <w:t>McKinsey &amp; Company, 2024</w:t>
-      </w:r>
-    </w:p>
-    <w:p>
-      <w:pPr>
-        <w:jc w:val="left"/>
-      </w:pPr>
-      <w:r>
-        <w:rPr>
-          <w:color w:val="333333"/>
-          <w:sz w:val="22"/>
-        </w:rPr>
-        <w:t>https://www.mckinsey.com/industries/life-sciences/our-insights/generative-ai-in-the-pharmaceutical-industry-moving-from-hype-to-reality</w:t>
-      </w:r>
-    </w:p>
-    <w:p>
-      <w:pPr>
-        <w:jc w:val="left"/>
-      </w:pPr>
-      <w:r>
-        <w:rPr>
-          <w:b/>
-          <w:color w:val="333333"/>
-          <w:sz w:val="22"/>
-        </w:rPr>
-        <w:t>Key insights:</w:t>
+        <w:t>Assessment:</w:t>
       </w:r>
       <w:r>
         <w:rPr>
           <w:color w:val="333333"/>
           <w:sz w:val="22"/>
         </w:rPr>
-        <w:t xml:space="preserve"> McKinsey estimates generative AI could create $5-7 billion in value for life sciences, with pharma R&amp;D representing 30-40% of that potential. The report emphasizes that the industry is shifting from experimentation to "purposeful transformation" where organizations must balance innovation with operational discipline. The analysis suggests that successful implementation requires strategic focus rather than broad adoption across all functions.</w:t>
-      </w:r>
-    </w:p>
-    <w:p>
-      <w:pPr>
-        <w:jc w:val="left"/>
-      </w:pPr>
-      <w:r>
-        <w:rPr>
-          <w:b/>
-          <w:color w:val="333333"/>
-          <w:sz w:val="22"/>
-        </w:rPr>
-        <w:t>Relevance to Plumtree:</w:t>
-      </w:r>
-      <w:r>
-        <w:rPr>
-          <w:color w:val="333333"/>
-          <w:sz w:val="22"/>
-        </w:rPr>
-        <w:t xml:space="preserve"> This quantified value proposition will likely drive executive pressure for AI adoption in R&amp;D organizations. However, the emphasis on "discipline and innovation coexisting" aligns with Plumtree's human-centric approach - successful transformation will depend on how well organizations manage the cultural and workflow changes, not just the technology deployment.</w:t>
-      </w:r>
-    </w:p>
-    <w:p>
-      <w:pPr>
-        <w:jc w:val="left"/>
-      </w:pPr>
-      <w:r>
-        <w:rPr>
-          <w:color w:val="333333"/>
-          <w:sz w:val="22"/>
-        </w:rPr>
-        <w:t>---</w:t>
-      </w:r>
-    </w:p>
-    <w:p>
-      <w:pPr>
-        <w:jc w:val="left"/>
-      </w:pPr>
-      <w:r>
-        <w:rPr>
-          <w:b/>
-          <w:color w:val="333333"/>
-          <w:sz w:val="22"/>
-        </w:rPr>
-        <w:t>Generative AI to Reshape the Future of Life Sciences</w:t>
-      </w:r>
-    </w:p>
-    <w:p>
-      <w:pPr>
-        <w:jc w:val="left"/>
-      </w:pPr>
-      <w:r>
-        <w:rPr>
-          <w:color w:val="333333"/>
-          <w:sz w:val="22"/>
-        </w:rPr>
-        <w:t>*Author not specified*</w:t>
-      </w:r>
-    </w:p>
-    <w:p>
-      <w:pPr>
-        <w:jc w:val="left"/>
-      </w:pPr>
-      <w:r>
-        <w:rPr>
-          <w:color w:val="333333"/>
-          <w:sz w:val="22"/>
-        </w:rPr>
-        <w:t>Deloitte, 2024</w:t>
-      </w:r>
-    </w:p>
-    <w:p>
-      <w:pPr>
-        <w:jc w:val="left"/>
-      </w:pPr>
-      <w:r>
-        <w:rPr>
-          <w:color w:val="333333"/>
-          <w:sz w:val="22"/>
-        </w:rPr>
-        <w:t>https://www.deloitte.com/us/en/Industries/life-sciences-health-care/articles/value-of-genai-in-pharma.html</w:t>
-      </w:r>
-    </w:p>
-    <w:p>
-      <w:pPr>
-        <w:jc w:val="left"/>
-      </w:pPr>
-      <w:r>
-        <w:rPr>
-          <w:b/>
-          <w:color w:val="333333"/>
-          <w:sz w:val="22"/>
-        </w:rPr>
-        <w:t>Key insights:</w:t>
-      </w:r>
-      <w:r>
-        <w:rPr>
-          <w:color w:val="333333"/>
-          <w:sz w:val="22"/>
-        </w:rPr>
-        <w:t xml:space="preserve"> Despite widespread enthusiasm, only 22% of life sciences organizations have successfully scaled AI implementations, and just 9% report significant returns on investment. The report identifies a gap between executive expectations and operational reality. Thirty percent of industry leaders cite "agentic AI" as a key trend for 2026, suggesting autonomous AI systems will become more prominent in research workflows.</w:t>
-      </w:r>
-    </w:p>
-    <w:p>
-      <w:pPr>
-        <w:jc w:val="left"/>
-      </w:pPr>
-      <w:r>
-        <w:rPr>
-          <w:b/>
-          <w:color w:val="333333"/>
-          <w:sz w:val="22"/>
-        </w:rPr>
-        <w:t>Relevance to Plumtree:</w:t>
-      </w:r>
-      <w:r>
-        <w:rPr>
-          <w:color w:val="333333"/>
-          <w:sz w:val="22"/>
-        </w:rPr>
-        <w:t xml:space="preserve"> The low success rates for AI scaling reflect the organizational challenges that Plumtree addresses - technology adoption fails when human factors are ignored. The 78% of organizations struggling to scale AI likely need transformation support focused on change management, team dynamics, and workflow redesign rather than additional technology investment.</w:t>
-      </w:r>
-    </w:p>
-    <w:p>
-      <w:pPr>
-        <w:jc w:val="left"/>
-      </w:pPr>
-      <w:r>
-        <w:rPr>
-          <w:color w:val="333333"/>
-          <w:sz w:val="22"/>
-        </w:rPr>
-        <w:t>---</w:t>
-      </w:r>
-    </w:p>
-    <w:p>
-      <w:pPr>
-        <w:jc w:val="left"/>
-      </w:pPr>
-      <w:r>
-        <w:rPr>
-          <w:color w:val="333333"/>
-          <w:sz w:val="22"/>
-        </w:rPr>
-        <w:t>### Assessment</w:t>
-      </w:r>
-    </w:p>
-    <w:p>
-      <w:pPr>
-        <w:jc w:val="left"/>
-      </w:pPr>
-      <w:r>
-        <w:rPr>
-          <w:color w:val="333333"/>
-          <w:sz w:val="22"/>
-        </w:rPr>
-        <w:t>The search results this week are thin on broader "future of work" insights, concentrating instead on AI applications specific to pharmaceutical R&amp;D. The McKinsey learning and development piece was too generic to include. The three selected articles provide useful data points about AI adoption challenges in life sciences but lack depth on the human and organizational factors that drive successful transformation.</w:t>
+        <w:t xml:space="preserve"> This week provided solid, substantive coverage of AI in life sciences R&amp;D. The sources are credible and focus on practical implementation challenges rather than speculative trends. The fourth result on learning and development was too generic and brief to warrant inclusion.</w:t>
       </w:r>
     </w:p>
     <w:p/>
@@ -1869,7 +1862,7 @@
         <w:t>## The So What This Week</w:t>
         <w:br/>
         <w:br/>
-        <w:t>The research this week reveals a fundamental mismatch between how organizations are approaching AI transformation and what actually makes it work. While life sciences companies are pouring resources into AI tools—with McKinsey estimating $5-7 billion in potential value—78% are failing to scale these implementations successfully. The disconnect isn't technical; it's human. Deloitte's team research shows that high-performing teams actually use AI more than their peers, but they deploy it to enhance human capabilities like emotional intelligence and connected teaming, not replace them. Meanwhile, the culture and leadership research emphasizes starting with single, observable behaviors rather than broad transformation mandates. The pattern is clear: organizations are leading with technology and following with people, when successful transformation requires the opposite sequence—building human capabilities first, then adding AI as an amplifier.</w:t>
+        <w:t>The research this week reveals a fundamental mismatch between how organizations are approaching AI transformation and what actually makes it work. While life sciences companies are investing heavily in AI tools—with McKinsey estimating $5-7 billion in potential value—only 22% have successfully scaled these initiatives and just 9% report meaningful returns. The gap isn't technical; it's human. The most compelling finding comes from Deloitte's research on high-performing teams, which shows that successful AI adoption happens when organizations focus on amplifying human capabilities like curiosity, resilience, and emotional intelligence rather than replacing human judgment. This creates a clear tension: executives are pursuing "agentic AI" and digital transformation while the evidence suggests they should be building the human capabilities that make AI partnerships effective. For R&amp;D organizations, this means transformation efforts need to start with how scientists actually collaborate and make decisions, not with the technology itself.</w:t>
       </w:r>
     </w:p>
     <w:sectPr>

</xml_diff>

<commit_message>
Update weekly research brief with latest synthesis
Regenerated report with refreshed Claude API synthesis across
all 5 categories.

https://claude.ai/code/session_01Rt8HdzBqYxkFytGa1ihFTH
</commit_message>
<xml_diff>
--- a/Plumtree_FoW_Brief_2026-04-06.docx
+++ b/Plumtree_FoW_Brief_2026-04-06.docx
@@ -112,7 +112,7 @@
           <w:color w:val="333333"/>
           <w:sz w:val="22"/>
         </w:rPr>
-        <w:t>This week produced several substantive pieces on team dynamics, with particular focus on how AI is reshaping collaboration patterns. The quality is solid, though the academic sources are more conceptual than immediately actionable.</w:t>
+        <w:t>This week delivered solid research on team dynamics, particularly around AI integration and organizational flexibility. Three substantive pieces stand out from academic and consulting sources.</w:t>
       </w:r>
     </w:p>
     <w:p>
@@ -161,7 +161,7 @@
           <w:color w:val="333333"/>
           <w:sz w:val="22"/>
         </w:rPr>
-        <w:t>January 2025</w:t>
+        <w:t>https://www.deloitte.com/us/en/insights/topics/talent/building-high-performing-teams.html</w:t>
       </w:r>
     </w:p>
     <w:p>
@@ -173,7 +173,7 @@
           <w:color w:val="333333"/>
           <w:sz w:val="22"/>
         </w:rPr>
-        <w:t>https://www.deloitte.com/us/en/insights/topics/talent/building-high-performing-teams.html</w:t>
+        <w:t>*January 2025*</w:t>
       </w:r>
     </w:p>
     <w:p>
@@ -193,7 +193,7 @@
           <w:color w:val="333333"/>
           <w:sz w:val="22"/>
         </w:rPr>
-        <w:t xml:space="preserve"> Deloitte surveyed 1,394 employees and found that high-performing teams distinguish themselves through six human capabilities: curiosity, resilience, divergent thinking, informed agility, connected teaming, and emotional/social intelligence. These teams use AI more frequently than others, but crucially, they use it to amplify human strengths rather than replace human judgment. The performance gaps are substantial — high-performing teams report 93% efficiency gains versus 77% for others, with similar advantages in problem-solving and collaboration.</w:t>
+        <w:t xml:space="preserve"> Deloitte surveyed 1,394 employees and found that high-performing teams distinguish themselves through six human capabilities: curiosity, resilience, divergent thinking, informed agility, connected teaming, and emotional/social intelligence. These teams use AI more frequently than others but treat it as a complement to human judgment rather than a replacement. The performance gaps are substantial — high-performing teams report 93% efficiency gains versus 77% for others, with similar advantages in problem-solving and collaboration.</w:t>
       </w:r>
     </w:p>
     <w:p>
@@ -213,7 +213,7 @@
           <w:color w:val="333333"/>
           <w:sz w:val="22"/>
         </w:rPr>
-        <w:t xml:space="preserve"> Life sciences R&amp;D teams often struggle with AI adoption because they focus on the technology rather than the human capabilities needed to work effectively with it. This research provides a concrete framework for assessing whether transformation efforts are building the right foundational skills. The emphasis on emotional and social intelligence is particularly relevant given the collaborative nature of drug discovery and clinical research.</w:t>
+        <w:t xml:space="preserve"> Life sciences R&amp;D teams often struggle with AI adoption because they focus on the technology rather than the human capabilities needed to work effectively with it. This research provides a concrete framework for assessing and developing the interpersonal skills that make scientific teams more effective, particularly as computational tools become more central to drug discovery and clinical research.</w:t>
       </w:r>
     </w:p>
     <w:p>
@@ -262,7 +262,7 @@
           <w:color w:val="333333"/>
           <w:sz w:val="22"/>
         </w:rPr>
-        <w:t>January 2025</w:t>
+        <w:t>https://www.sciencedirect.com/science/article/pii/S0148296325006186</w:t>
       </w:r>
     </w:p>
     <w:p>
@@ -274,7 +274,7 @@
           <w:color w:val="333333"/>
           <w:sz w:val="22"/>
         </w:rPr>
-        <w:t>https://www.sciencedirect.com/science/article/pii/S0148296325006186</w:t>
+        <w:t>*January 2025*</w:t>
       </w:r>
     </w:p>
     <w:p>
@@ -294,7 +294,7 @@
           <w:color w:val="333333"/>
           <w:sz w:val="22"/>
         </w:rPr>
-        <w:t xml:space="preserve"> This academic paper introduces "flubber teaming" — teams that dynamically reconfigure their structure, hierarchy, and membership based on project needs, much like the shape-shifting material from the Disney film. Digital platforms enable this fluidity by making it easier to identify talent, form temporary teams, and dissolve them when projects end. The research suggests this model is becoming more common in large organizations that need to respond quickly to changing demands while maintaining access to specialized expertise.</w:t>
+        <w:t xml:space="preserve"> This paper introduces "flubber teaming" — teams that change shape, hierarchy, and composition dynamically in response to project demands. Digital platforms enable organizations to move beyond static organizational charts toward fluid, project-based team configurations. The research examines how technology mediates the formation and dissolution of teams, allowing large organizations to reconfigure talent rapidly as needs shift.</w:t>
       </w:r>
     </w:p>
     <w:p>
@@ -314,7 +314,7 @@
           <w:color w:val="333333"/>
           <w:sz w:val="22"/>
         </w:rPr>
-        <w:t xml:space="preserve"> Pharmaceutical R&amp;D naturally operates through project-based work that spans multiple disciplines and time horizons. The flubber teaming concept could help life sciences organizations move beyond rigid departmental silos toward more responsive team structures. However, the regulatory and quality requirements in pharma may create constraints that limit how fluid these teams can actually become.</w:t>
+        <w:t xml:space="preserve"> Pharmaceutical R&amp;D increasingly requires cross-functional collaboration that doesn't fit traditional departmental structures — think drug discovery teams that need computational biologists, medicinal chemists, and regulatory experts working together temporarily. Understanding how to design systems that support fluid team formation could help life sciences organizations respond more quickly to scientific opportunities and regulatory changes.</w:t>
       </w:r>
     </w:p>
     <w:p>
@@ -363,7 +363,7 @@
           <w:color w:val="333333"/>
           <w:sz w:val="22"/>
         </w:rPr>
-        <w:t>January 2025</w:t>
+        <w:t>https://www.sciencedirect.com/science/article/pii/S2352250X24000502</w:t>
       </w:r>
     </w:p>
     <w:p>
@@ -375,7 +375,7 @@
           <w:color w:val="333333"/>
           <w:sz w:val="22"/>
         </w:rPr>
-        <w:t>https://www.sciencedirect.com/science/article/pii/S2352250X24000502</w:t>
+        <w:t>*January 2025*</w:t>
       </w:r>
     </w:p>
     <w:p>
@@ -395,7 +395,7 @@
           <w:color w:val="333333"/>
           <w:sz w:val="22"/>
         </w:rPr>
-        <w:t xml:space="preserve"> Human-AI teams consistently underperform expectations because we apply traditional team frameworks to fundamentally different collaboration patterns. The paper argues that effective human-AI teaming requires new approaches to role definition, communication protocols, and shared mental models. Standard team science principles assume all team members have similar cognitive architectures and social needs, which breaks down when one "member" is an algorithm.</w:t>
+        <w:t xml:space="preserve"> Human-AI teams frequently underperform because of poor team cognition and mutual understanding between human and artificial team members. The authors argue that effective AI-teaming requires fundamentally rethinking role design, communication protocols, and shared mental models when one team member is a machine. Traditional team science frameworks, developed for all-human teams, need updating for hybrid contexts.</w:t>
       </w:r>
     </w:p>
     <w:p>
@@ -415,7 +415,7 @@
           <w:color w:val="333333"/>
           <w:sz w:val="22"/>
         </w:rPr>
-        <w:t xml:space="preserve"> Life sciences organizations are rapidly integrating AI into research workflows, but many treat it as just another tool rather than a team member requiring different collaboration approaches. This research suggests that transformation efforts need to explicitly redesign how teams operate when AI is involved, particularly in areas like drug discovery where human expertise and machine pattern recognition need to work together effectively.</w:t>
+        <w:t xml:space="preserve"> As AI tools become more sophisticated in drug discovery and clinical trial design, R&amp;D teams need new frameworks for working effectively with these systems. This research suggests that the problem isn't just technical integration but developing new collaboration patterns — something directly relevant to transformation work in organizations where scientists are increasingly working alongside AI systems for compound optimization, patient stratification, and data analysis.</w:t>
       </w:r>
     </w:p>
     <w:p/>
@@ -453,7 +453,7 @@
           <w:color w:val="333333"/>
           <w:sz w:val="22"/>
         </w:rPr>
-        <w:t>## Organization Systems Research Brief</w:t>
+        <w:t>## Weekly Research Brief: Organization Systems</w:t>
       </w:r>
     </w:p>
     <w:p>
@@ -465,7 +465,7 @@
           <w:color w:val="333333"/>
           <w:sz w:val="22"/>
         </w:rPr>
-        <w:t>This week produced several substantial pieces on organizational transformation in life sciences, with particularly strong coverage from McKinsey on pharma-specific challenges.</w:t>
+        <w:t>This week yielded several substantial pieces on organizational transformation in life sciences, with particularly strong coverage from McKinsey on pharma-specific challenges and Harvard Business Review on transformation under uncertainty.</w:t>
       </w:r>
     </w:p>
     <w:p>
@@ -502,7 +502,7 @@
           <w:color w:val="333333"/>
           <w:sz w:val="22"/>
         </w:rPr>
-        <w:t>*Harvard Business Review* | [URL](https://hbr.org/2026/01/how-one-company-achieved-a-bold-transformation-despite-major-unknowns)</w:t>
+        <w:t>Harvard Business Review | https://hbr.org/2026/01/how-one-company-achieved-a-bold-transformation-despite-major-unknowns</w:t>
       </w:r>
     </w:p>
     <w:p>
@@ -522,7 +522,7 @@
           <w:color w:val="333333"/>
           <w:sz w:val="22"/>
         </w:rPr>
-        <w:t xml:space="preserve"> This HBR case study challenges the conventional wisdom that successful transformation requires detailed upfront planning and risk elimination. Instead, it argues that leaders must build adaptive capacity and learn through action rather than analysis. The piece emphasizes that trying to resolve all uncertainties before moving forward often paralyzes organizations, while successful transformers develop comfort with ambiguity and iterate their way to solutions.</w:t>
+        <w:t xml:space="preserve"> This case study challenges the conventional wisdom that successful transformation requires detailed upfront planning and risk elimination. The featured company succeeded by building adaptive capacity rather than trying to predict and control every variable. Leaders embraced ambiguity as a natural part of transformation, focusing on learning through action rather than analysis paralysis. The approach emphasizes rapid experimentation and course correction over comprehensive strategic planning.</w:t>
       </w:r>
     </w:p>
     <w:p>
@@ -542,7 +542,7 @@
           <w:color w:val="333333"/>
           <w:sz w:val="22"/>
         </w:rPr>
-        <w:t xml:space="preserve"> Life sciences R&amp;D organizations face inherent uncertainty in both their science and their organizational evolution. This approach of building adaptive capacity rather than perfect plans aligns with how research teams already work—forming hypotheses, testing, and adjusting based on results. The challenge is helping R&amp;D leaders apply this same experimental mindset to organizational change rather than defaulting to over-engineered transformation plans.</w:t>
+        <w:t xml:space="preserve"> Life sciences R&amp;D organizations operate in inherently uncertain environments where scientific discovery timelines are unpredictable and regulatory landscapes shift frequently. This adaptive approach to transformation could help R&amp;D teams move forward with organizational changes even when they can't fully predict outcomes, which is particularly relevant given the long development cycles and high failure rates that characterize pharmaceutical research.</w:t>
       </w:r>
     </w:p>
     <w:p>
@@ -579,7 +579,7 @@
           <w:color w:val="333333"/>
           <w:sz w:val="22"/>
         </w:rPr>
-        <w:t>*McKinsey &amp; Company* | [URL](https://www.mckinsey.com/industries/life-sciences/our-insights/against-the-odds-how-life-sciences-companies-excel-in-large-transformations)</w:t>
+        <w:t>McKinsey &amp; Company | https://www.mckinsey.com/industries/life-sciences/our-insights/against-the-odds-how-life-sciences-companies-excel-in-large-transformations</w:t>
       </w:r>
     </w:p>
     <w:p>
@@ -599,7 +599,7 @@
           <w:color w:val="333333"/>
           <w:sz w:val="22"/>
         </w:rPr>
-        <w:t xml:space="preserve"> The scale of transformation in pharma is remarkable—26 of the 30 largest global pharmaceutical companies have announced major transformations in just five years. This suggests the industry is grappling with fundamental structural challenges that require wholesale organizational redesign, not incremental fixes. The piece examines what separates successful transformations from the failures, though the specific differentiating factors aren't detailed in the search results.</w:t>
+        <w:t xml:space="preserve"> The scale of transformation in pharma is remarkable—26 of the 30 largest global pharmaceutical companies have announced major transformations in just five years. This suggests the industry is grappling with fundamental structural challenges that require wholesale organizational redesign. The piece identifies specific factors that separate successful transformations from failures, though the search results don't detail these differentiating factors.</w:t>
       </w:r>
     </w:p>
     <w:p>
@@ -619,7 +619,7 @@
           <w:color w:val="333333"/>
           <w:sz w:val="22"/>
         </w:rPr>
-        <w:t xml:space="preserve"> The prevalence of large-scale transformation attempts indicates that incremental change isn't sufficient for most life sciences organizations. This validates the need for comprehensive transformation approaches while highlighting the importance of understanding what actually works. For R&amp;D organizations specifically, this suggests they're likely part of broader company-wide changes rather than isolated departmental improvements.</w:t>
+        <w:t xml:space="preserve"> The prevalence of transformation efforts across major pharma companies indicates this isn't about individual company problems but industry-wide structural issues. Understanding what makes some transformations succeed while others fail is directly relevant to Plumtree's work, as it suggests there are identifiable patterns and practices that can be applied to improve transformation outcomes in R&amp;D settings.</w:t>
       </w:r>
     </w:p>
     <w:p>
@@ -656,7 +656,7 @@
           <w:color w:val="333333"/>
           <w:sz w:val="22"/>
         </w:rPr>
-        <w:t>*McKinsey &amp; Company* | [URL](https://www.mckinsey.com/industries/life-sciences/our-insights/simplification-for-success-rewiring-the-biopharma-operating-model)</w:t>
+        <w:t>McKinsey &amp; Company | https://www.mckinsey.com/industries/life-sciences/our-insights/simplification-for-success-rewiring-the-biopharma-operating-model</w:t>
       </w:r>
     </w:p>
     <w:p>
@@ -676,7 +676,7 @@
           <w:color w:val="333333"/>
           <w:sz w:val="22"/>
         </w:rPr>
-        <w:t xml:space="preserve"> Some biopharma companies are achieving significant improvements by eliminating organizational layers rather than adding them. One example consolidated from multiple regional structures to just two regions (international and US), using an "above-market vs. in-market" framework. This brought decision-making closer to customers, reduced bureaucratic overhead, and clarified employee roles—demonstrating that structural simplification can solve multiple organizational problems simultaneously.</w:t>
+        <w:t xml:space="preserve"> Biopharma companies are finding success by eliminating organizational layers rather than adding them. One company's consolidation from multiple regions to just two—international and US—demonstrates how structural simplification can bring decision-making closer to customers and reduce bureaucratic friction. The shift to "above-market vs. in-market" structures represents a fundamental rethinking of how global organizations can operate more effectively.</w:t>
       </w:r>
     </w:p>
     <w:p>
@@ -696,7 +696,7 @@
           <w:color w:val="333333"/>
           <w:sz w:val="22"/>
         </w:rPr>
-        <w:t xml:space="preserve"> R&amp;D organizations often suffer from similar layering problems, with matrix structures that create unclear accountability and slow decision-making. The principle of bringing decisions closer to the actual work (analogous to bringing decisions closer to customers) could mean giving research teams more authority and reducing the number of approval layers for scientific decisions. This structural approach addresses the human element by giving people clearer roles and more direct impact.</w:t>
+        <w:t xml:space="preserve"> R&amp;D organizations often suffer from similar layering problems, with matrix structures that create unclear accountability and slow decision-making. The specific example of regional consolidation offers a concrete model for how life sciences companies can simplify without losing necessary coordination. This structural approach to reducing complexity could be particularly valuable for R&amp;D teams struggling with overlapping responsibilities between discovery, development, and commercial functions.</w:t>
       </w:r>
     </w:p>
     <w:p>
@@ -733,7 +733,7 @@
           <w:color w:val="333333"/>
           <w:sz w:val="22"/>
         </w:rPr>
-        <w:t>*Deloitte Insights* | [URL](https://www.deloitte.com/us/en/insights/industry/health-care/life-sciences-and-health-care-industry-outlooks/2026-life-sciences-executive-outlook.html)</w:t>
+        <w:t>Deloitte Insights | https://www.deloitte.com/us/en/insights/industry/health-care/life-sciences-and-health-care-industry-outlooks/2026-life-sciences-executive-outlook.html</w:t>
       </w:r>
     </w:p>
     <w:p>
@@ -753,7 +753,7 @@
           <w:color w:val="333333"/>
           <w:sz w:val="22"/>
         </w:rPr>
-        <w:t xml:space="preserve"> Despite heavy investment in digital transformation and AI, actual results remain limited—only 22% of life sciences companies have successfully scaled AI, and just 9% report significant returns. This gap between investment and results suggests that the technical implementation of new tools isn't the primary challenge. The data indicates that organizational and human factors may be the real barriers to realizing value from digital initiatives.</w:t>
+        <w:t xml:space="preserve"> The gap between AI ambition and execution in life sciences is stark—while 30% of leaders cite agentic AI as a key trend, only 22% have successfully scaled AI initiatives and just 9% report significant returns. This suggests the industry is still in early stages of translating AI investments into operational value. The 48% of leaders identifying accelerated digital transformation as having substantial impact indicates continued organizational pressure to modernize.</w:t>
       </w:r>
     </w:p>
     <w:p>
@@ -773,7 +773,7 @@
           <w:color w:val="333333"/>
           <w:sz w:val="22"/>
         </w:rPr>
-        <w:t xml:space="preserve"> The low success rates for AI scaling in life sciences highlight that technology adoption is fundamentally an organizational challenge, not a technical one. R&amp;D organizations investing in AI and digital tools need to focus as much on how people work with these technologies as on the technologies themselves. This reinforces the importance of human-centric transformation approaches that address workflow, culture, and capability building alongside technical implementation.</w:t>
+        <w:t xml:space="preserve"> The AI implementation gap reveals a classic transformation challenge—the difficulty of moving from pilot projects to scaled organizational change. R&amp;D organizations investing heavily in AI tools may be struggling with the human and process changes needed to realize value, which aligns directly with Plumtree's focus on how people actually work together during technological transitions.</w:t>
       </w:r>
     </w:p>
     <w:p/>
@@ -823,7 +823,7 @@
           <w:color w:val="333333"/>
           <w:sz w:val="22"/>
         </w:rPr>
-        <w:t>This week yielded several substantive pieces on organizational culture, with particularly relevant insights for life sciences R&amp;D transformation work.</w:t>
+        <w:t>This week yielded several substantial pieces on organizational culture, with particular relevance to how scientific organizations can navigate change and AI integration.</w:t>
       </w:r>
     </w:p>
     <w:p>
@@ -892,7 +892,7 @@
           <w:color w:val="333333"/>
           <w:sz w:val="22"/>
         </w:rPr>
-        <w:t xml:space="preserve"> The article argues that effective culture change starts by identifying and shifting a single high-impact behavior rather than attempting broad transformation. This behavior should cascade naturally through the organization, creating ripple effects that influence other practices and norms. The approach recognizes that behavior drives culture more than mission statements or values exercises, making change more tangible and measurable.</w:t>
+        <w:t xml:space="preserve"> Rather than attempting broad cultural overhauls, effective change starts by identifying a single behavior that creates ripple effects throughout the organization. The authors argue that behavior drives culture more than values or mission statements do. They emphasize finding behaviors that naturally cascade—where one person's change influences others to change as well. This approach acknowledges that sustainable culture change happens through concrete actions, not abstract concepts.</w:t>
       </w:r>
     </w:p>
     <w:p>
@@ -912,7 +912,7 @@
           <w:color w:val="333333"/>
           <w:sz w:val="22"/>
         </w:rPr>
-        <w:t xml:space="preserve"> This directly supports our human-centric approach to R&amp;D transformation. Instead of launching sweeping culture initiatives, we can help clients identify specific behaviors that matter most in their research environment—perhaps how teams share negative results or how they collaborate across therapeutic areas. This behavioral focus gives scientists concrete actions to practice rather than abstract cultural concepts to embrace.</w:t>
+        <w:t xml:space="preserve"> This directly supports our human-centric approach to R&amp;D transformation. Instead of launching sweeping "innovation culture" initiatives, we can help clients identify specific behaviors—like how teams share negative results or how senior scientists engage with junior researchers—that will naturally spread and reshape how the organization actually works. This behavioral focus aligns with how scientists think: concrete, observable, measurable.</w:t>
       </w:r>
     </w:p>
     <w:p>
@@ -981,7 +981,7 @@
           <w:color w:val="333333"/>
           <w:sz w:val="22"/>
         </w:rPr>
-        <w:t xml:space="preserve"> The piece defines "high agency" as the capacity to act despite ambiguity by choosing beliefs that expand what people notice, expect, and attempt. Leaders can deliberately cultivate this mindset to replace cultures of blame and helplessness with ones oriented toward experimentation and problem-solving. The framework provides practical steps for building agency rather than just describing its benefits.</w:t>
+        <w:t xml:space="preserve"> High-agency cultures enable people to act effectively despite uncertainty by helping them choose beliefs that expand their perception of what's possible. This contrasts with low-agency cultures where people feel constrained by circumstances and blame external factors. The framework focuses on helping people notice more opportunities, expect better outcomes, and attempt more ambitious solutions. Leaders build this by modeling agency themselves and creating systems that reward initiative over compliance.</w:t>
       </w:r>
     </w:p>
     <w:p>
@@ -1001,7 +1001,7 @@
           <w:color w:val="333333"/>
           <w:sz w:val="22"/>
         </w:rPr>
-        <w:t xml:space="preserve"> High agency is essential in R&amp;D environments where uncertainty is constant and breakthrough discoveries require people to act before all the data is in. This framework could help our clients move away from risk-averse cultures that punish failure toward ones that reward intelligent experimentation. For scientists and doctors, this means creating conditions where they feel confident to pursue promising but uncertain research directions.</w:t>
+        <w:t xml:space="preserve"> R&amp;D environments are inherently uncertain, making agency crucial for scientific progress. Many life sciences organizations inadvertently create low-agency cultures through excessive risk aversion and blame-focused post-mortems when experiments fail. We can help clients redesign how they respond to failure and uncertainty, shifting from "why did this go wrong?" to "what can we try next?" This is particularly relevant for organizations struggling with innovation timelines and breakthrough thinking.</w:t>
       </w:r>
     </w:p>
     <w:p>
@@ -1070,7 +1070,7 @@
           <w:color w:val="333333"/>
           <w:sz w:val="22"/>
         </w:rPr>
-        <w:t xml:space="preserve"> Life sciences and pharma companies are beginning to envision AI agents working alongside researchers in R&amp;D, with the goal of accelerating innovation rather than replacing human scientists. The integration requires building cultures that can effectively blend human judgment with AI capabilities. Organizations must rethink how decisions get made and how trust operates when AI agents become active participants in research processes.</w:t>
+        <w:t xml:space="preserve"> Life sciences companies are beginning to deploy AI agents that work alongside researchers rather than replacing them, potentially accelerating innovation cycles significantly. The integration requires new cultural norms around human-AI collaboration, including how teams make decisions when AI provides recommendations and how to maintain scientific rigor with AI-generated insights. Success depends on building trust between researchers and AI systems while preserving the critical thinking that drives scientific breakthroughs.</w:t>
       </w:r>
     </w:p>
     <w:p>
@@ -1090,7 +1090,31 @@
           <w:color w:val="333333"/>
           <w:sz w:val="22"/>
         </w:rPr>
-        <w:t xml:space="preserve"> This speaks directly to a challenge many of our life sciences clients face: how to integrate AI tools without undermining the collaborative relationships that drive good science. The cultural implications go beyond technology adoption to fundamental questions about how research teams work together. Our transformation work needs to address both the human dynamics and the new workflows that emerge when AI becomes a research partner rather than just a tool.</w:t>
+        <w:t xml:space="preserve"> Our clients are grappling with AI integration in drug discovery, clinical trials, and research processes. The cultural challenge isn't technical—it's helping scientists maintain their identity and expertise while working with AI tools. We can support organizations in developing new collaboration patterns that preserve scientific skepticism and peer review while embracing AI's analytical capabilities. This requires careful attention to how power dynamics and decision-making authority shift when AI becomes a research partner.</w:t>
+      </w:r>
+    </w:p>
+    <w:p>
+      <w:pPr>
+        <w:jc w:val="left"/>
+      </w:pPr>
+      <w:r>
+        <w:rPr>
+          <w:color w:val="333333"/>
+          <w:sz w:val="22"/>
+        </w:rPr>
+        <w:t>---</w:t>
+      </w:r>
+    </w:p>
+    <w:p>
+      <w:pPr>
+        <w:jc w:val="left"/>
+      </w:pPr>
+      <w:r>
+        <w:rPr>
+          <w:color w:val="333333"/>
+          <w:sz w:val="22"/>
+        </w:rPr>
+        <w:t>*Note: The Deloitte Global Human Capital Trends piece was too broad and generic for inclusion, focusing on general workforce trends rather than actionable cultural insights.*</w:t>
       </w:r>
     </w:p>
     <w:p/>
@@ -1140,7 +1164,7 @@
           <w:color w:val="333333"/>
           <w:sz w:val="22"/>
         </w:rPr>
-        <w:t>This week's search results offer some substantive insights, though the selection is relatively thin. Three articles from reputable sources provide useful perspectives on leadership challenges, while one appears to be from a future date and should be disregarded.</w:t>
+        <w:t>This week's leadership research offers some substantive insights, though the selection is modest. Three articles from reputable sources provide concrete findings about AI implementation realities, leadership development approaches, and human-AI collaboration strategies.</w:t>
       </w:r>
     </w:p>
     <w:p>
@@ -1165,7 +1189,7 @@
           <w:color w:val="333333"/>
           <w:sz w:val="22"/>
         </w:rPr>
-        <w:t>The art of 21st-century leadership: From succession planning to building a leadership factory</w:t>
+        <w:t>How Leaders Face the Future of Work</w:t>
       </w:r>
     </w:p>
     <w:p>
@@ -1177,7 +1201,7 @@
           <w:color w:val="333333"/>
           <w:sz w:val="22"/>
         </w:rPr>
-        <w:t>McKinsey &amp; Company</w:t>
+        <w:t>Author: Lynda Gratton</w:t>
       </w:r>
     </w:p>
     <w:p>
@@ -1189,7 +1213,19 @@
           <w:color w:val="333333"/>
           <w:sz w:val="22"/>
         </w:rPr>
-        <w:t>[https://www.mckinsey.com/capabilities/strategy-and-corporate-finance/our-insights/the-art-of-21st-century-leadership-from-succession-planning-to-building-a-leadership-factory](https://www.mckinsey.com/capabilities/strategy-and-corporate-finance/our-insights/the-art-of-21st-century-leadership-from-succession-planning-to-building-a-leadership-factory)</w:t>
+        <w:t>*MIT Sloan Management Review* | [Date from source]</w:t>
+      </w:r>
+    </w:p>
+    <w:p>
+      <w:pPr>
+        <w:jc w:val="left"/>
+      </w:pPr>
+      <w:r>
+        <w:rPr>
+          <w:color w:val="333333"/>
+          <w:sz w:val="22"/>
+        </w:rPr>
+        <w:t>Source: https://sloanreview.mit.edu/article/how-leaders-face-the-future-of-work/</w:t>
       </w:r>
     </w:p>
     <w:p>
@@ -1209,7 +1245,7 @@
           <w:color w:val="333333"/>
           <w:sz w:val="22"/>
         </w:rPr>
-        <w:t xml:space="preserve"> CEOs consistently identify talent and leadership team capabilities as their biggest operational hurdles. The traditional approach of succession planning—identifying and grooming individual replacements—is insufficient for today's pace of change. Instead, organizations need systematic approaches to continuously develop leadership capabilities across multiple levels, creating what the authors call a "leadership factory" that can adapt to both current challenges and future uncertainties.</w:t>
+        <w:t xml:space="preserve"> Gratton argues that leaders must treat decision-making as a strategic discipline rather than an ad-hoc process. The piece emphasizes the critical importance of intentionally designing how humans and AI share judgment and accountability in organizational decisions. This deliberate approach is essential for maintaining trust and protecting human agency as AI becomes more prevalent in workplace decisions.</w:t>
       </w:r>
     </w:p>
     <w:p>
@@ -1229,7 +1265,7 @@
           <w:color w:val="333333"/>
           <w:sz w:val="22"/>
         </w:rPr>
-        <w:t xml:space="preserve"> Life sciences R&amp;D organizations face particularly acute leadership challenges given the technical complexity of their work and the long timelines of drug development. The "leadership factory" concept applies directly to building scientific leadership capabilities that can navigate both technical decisions and organizational transformation. This systematic approach to leadership development could help R&amp;D organizations avoid the common trap of promoting excellent scientists into leadership roles without adequate preparation.</w:t>
+        <w:t xml:space="preserve"> Life sciences R&amp;D organizations are increasingly integrating AI tools into research processes, from drug discovery to clinical trial design. The framework for intentionally designing human-AI collaboration is directly applicable to transformation work, as scientists and research leaders need clear protocols for when human judgment should override algorithmic recommendations, particularly in high-stakes research decisions.</w:t>
       </w:r>
     </w:p>
     <w:p>
@@ -1254,7 +1290,7 @@
           <w:color w:val="333333"/>
           <w:sz w:val="22"/>
         </w:rPr>
-        <w:t>How Leaders Face the Future of Work</w:t>
+        <w:t>The art of 21st-century leadership: From succession planning to building a leadership factory</w:t>
       </w:r>
     </w:p>
     <w:p>
@@ -1266,7 +1302,7 @@
           <w:color w:val="333333"/>
           <w:sz w:val="22"/>
         </w:rPr>
-        <w:t>Lynda Gratton, MIT Sloan Management Review</w:t>
+        <w:t>Author: [Not specified in search results]</w:t>
       </w:r>
     </w:p>
     <w:p>
@@ -1278,7 +1314,19 @@
           <w:color w:val="333333"/>
           <w:sz w:val="22"/>
         </w:rPr>
-        <w:t>[https://sloanreview.mit.edu/article/how-leaders-face-the-future-of-work/](https://sloanreview.mit.edu/article/how-leaders-face-the-future-of-work/)</w:t>
+        <w:t>*McKinsey &amp; Company* | [Date from source]</w:t>
+      </w:r>
+    </w:p>
+    <w:p>
+      <w:pPr>
+        <w:jc w:val="left"/>
+      </w:pPr>
+      <w:r>
+        <w:rPr>
+          <w:color w:val="333333"/>
+          <w:sz w:val="22"/>
+        </w:rPr>
+        <w:t>Source: https://www.mckinsey.com/capabilities/strategy-and-corporate-finance/our-insights/the-art-of-21st-century-leadership-from-succession-planning-to-building-a-leadership-factory</w:t>
       </w:r>
     </w:p>
     <w:p>
@@ -1298,7 +1346,7 @@
           <w:color w:val="333333"/>
           <w:sz w:val="22"/>
         </w:rPr>
-        <w:t xml:space="preserve"> Leaders must treat decision-making as a strategic discipline rather than an ad hoc process. The integration of AI into work requires intentional design of how humans and machines share judgment and accountability. Maintaining trust and protecting human agency becomes critical as AI takes on more decision-support roles. The article emphasizes that successful leaders actively design these human-AI partnerships rather than letting them evolve organically.</w:t>
+        <w:t xml:space="preserve"> Research shows CEOs consistently identify talent and leadership team capabilities as their biggest operational hurdles. The article advocates moving beyond traditional succession planning toward building systematic "leadership factories" that continuously develop capabilities. This approach focuses on building leadership skills proactively rather than reactively filling positions when they become vacant.</w:t>
       </w:r>
     </w:p>
     <w:p>
@@ -1318,7 +1366,7 @@
           <w:color w:val="333333"/>
           <w:sz w:val="22"/>
         </w:rPr>
-        <w:t xml:space="preserve"> In R&amp;D environments where scientific judgment is paramount, the question of how AI supports versus replaces human decision-making is particularly sensitive. Scientists and doctors need frameworks for maintaining their professional judgment while benefiting from AI capabilities. This applies directly to transformation work that involves implementing new technologies while preserving the scientific rigor and human expertise that drives innovation.</w:t>
+        <w:t xml:space="preserve"> Life sciences R&amp;D organizations face unique leadership challenges as they need leaders who understand both scientific rigor and business transformation. The "leadership factory" concept is particularly relevant for developing research leaders who can navigate regulatory environments, manage cross-functional teams, and drive innovation while maintaining scientific integrity.</w:t>
       </w:r>
     </w:p>
     <w:p>
@@ -1343,7 +1391,7 @@
           <w:color w:val="333333"/>
           <w:sz w:val="22"/>
         </w:rPr>
-        <w:t>Why Digital Dexterity Is Key to Transformation</w:t>
+        <w:t>9 Trends Shaping Work in 2026 and Beyond</w:t>
       </w:r>
     </w:p>
     <w:p>
@@ -1355,7 +1403,7 @@
           <w:color w:val="333333"/>
           <w:sz w:val="22"/>
         </w:rPr>
-        <w:t>MIT Sloan Management Review</w:t>
+        <w:t>Author: [Not specified in search results]</w:t>
       </w:r>
     </w:p>
     <w:p>
@@ -1367,7 +1415,19 @@
           <w:color w:val="333333"/>
           <w:sz w:val="22"/>
         </w:rPr>
-        <w:t>[https://sloanreview.mit.edu/article/why-digital-dexterity-is-key-to-transformation/](https://sloanreview.mit.edu/article/why-digital-dexterity-is-key-to-transformation/)</w:t>
+        <w:t>*Harvard Business Review* | [Date from source]</w:t>
+      </w:r>
+    </w:p>
+    <w:p>
+      <w:pPr>
+        <w:jc w:val="left"/>
+      </w:pPr>
+      <w:r>
+        <w:rPr>
+          <w:color w:val="333333"/>
+          <w:sz w:val="22"/>
+        </w:rPr>
+        <w:t>Source: https://hbr.org/2026/02/9-trends-shaping-work-in-2026-and-beyond</w:t>
       </w:r>
     </w:p>
     <w:p>
@@ -1387,7 +1447,7 @@
           <w:color w:val="333333"/>
           <w:sz w:val="22"/>
         </w:rPr>
-        <w:t xml:space="preserve"> Digital dexterity combines both willingness and ability to use new technologies effectively. Organizations need to integrate learning directly into daily work processes rather than treating it as separate training events. The concept of "learning organizations" is evolving to mean places where skill development happens continuously through work itself, particularly as generative AI and other technologies require ongoing adaptation rather than one-time implementation.</w:t>
+        <w:t xml:space="preserve"> The article provides sobering data on AI implementation: only 1 in 50 AI investments deliver transformational value, and only 1 in 5 deliver any measurable ROI. This reality check contrasts sharply with CEO expectations for AI-driven growth, suggesting a significant gap between leadership expectations and actual AI performance in most organizations.</w:t>
       </w:r>
     </w:p>
     <w:p>
@@ -1407,7 +1467,7 @@
           <w:color w:val="333333"/>
           <w:sz w:val="22"/>
         </w:rPr>
-        <w:t xml:space="preserve"> R&amp;D scientists often have high technical ability but may resist new digital tools that seem to interfere with established research processes. The emphasis on integrating learning into daily work aligns well with how scientists naturally learn—through experimentation and iteration. This approach could help R&amp;D organizations adopt new technologies without interfering with the fundamental scientific methods that drive their success.</w:t>
+        <w:t xml:space="preserve"> These AI implementation statistics are particularly relevant for life sciences organizations investing heavily in AI for drug discovery, clinical trials, and research automation. Transformation practitioners need to help research leaders set realistic expectations and develop more disciplined approaches to AI investment, focusing on specific use cases where AI can demonstrably improve research outcomes rather than broad technological adoption.</w:t>
       </w:r>
     </w:p>
     <w:p>
@@ -1439,7 +1499,7 @@
           <w:color w:val="333333"/>
           <w:sz w:val="22"/>
         </w:rPr>
-        <w:t xml:space="preserve"> The first search result appears to be dated February 2026, which suggests it may be speculative content or incorrectly dated. I've excluded it from this analysis to maintain reliability.</w:t>
+        <w:t xml:space="preserve"> The fourth article on "Digital Dexterity" was excluded as it relies heavily on buzzword-heavy language without providing concrete, actionable insights for practitioners.</w:t>
       </w:r>
     </w:p>
     <w:p/>
@@ -1477,7 +1537,7 @@
           <w:color w:val="333333"/>
           <w:sz w:val="22"/>
         </w:rPr>
-        <w:t>## AI and the Future of Work - Weekly Research Brief</w:t>
+        <w:t>## AI and the Future of Work: Weekly Research Brief</w:t>
       </w:r>
     </w:p>
     <w:p>
@@ -1489,7 +1549,7 @@
           <w:color w:val="333333"/>
           <w:sz w:val="22"/>
         </w:rPr>
-        <w:t>This week's search results focus heavily on AI applications in life sciences, with three substantive pieces examining the current state and future potential of AI in pharmaceutical R&amp;D.</w:t>
+        <w:t>This week's search results focus heavily on AI applications in life sciences rather than broader workforce transformation themes. The quality is mixed, with some substantive industry analysis alongside more promotional content.</w:t>
       </w:r>
     </w:p>
     <w:p>
@@ -1501,7 +1561,7 @@
           <w:color w:val="333333"/>
           <w:sz w:val="22"/>
         </w:rPr>
-        <w:t>---</w:t>
+        <w:t>### Selected Articles</w:t>
       </w:r>
     </w:p>
     <w:p>
@@ -1570,7 +1630,7 @@
           <w:color w:val="333333"/>
           <w:sz w:val="22"/>
         </w:rPr>
-        <w:t xml:space="preserve"> This academic review examines how AI, machine learning, and deep learning are transforming traditional drug discovery models. The authors document specific advances in drug characterization, target discovery, small molecule design, and clinical trial processes. The paper emphasizes measurable improvements in efficiency, accuracy, and success rates while reducing both timelines and costs. The focus is on concrete applications rather than theoretical potential.</w:t>
+        <w:t xml:space="preserve"> This academic review examines how AI, machine learning, and deep learning are changing drug discovery workflows. The authors document specific improvements in drug characterization, target identification, small molecule design, and clinical trial processes. They present evidence that AI integration reduces both development timelines and costs while improving success rates. The paper appears to synthesize current applications rather than speculating about future possibilities.</w:t>
       </w:r>
     </w:p>
     <w:p>
@@ -1590,7 +1650,7 @@
           <w:color w:val="333333"/>
           <w:sz w:val="22"/>
         </w:rPr>
-        <w:t xml:space="preserve"> Life sciences R&amp;D organizations are implementing these AI tools now, not in some distant future. This creates immediate transformation challenges around workflow integration, skill development, and change management. Teams need support navigating how these technologies actually change daily research practices and collaboration patterns.</w:t>
+        <w:t xml:space="preserve"> R&amp;D organizations implementing AI tools will need to restructure how teams collaborate between computational and experimental scientists. The shift from traditional discovery methods to AI-augmented workflows requires new skills, different decision-making processes, and updated project management approaches that transformation practitioners need to understand.</w:t>
       </w:r>
     </w:p>
     <w:p>
@@ -1639,7 +1699,7 @@
           <w:color w:val="333333"/>
           <w:sz w:val="22"/>
         </w:rPr>
-        <w:t>McKinsey &amp; Company, 2025</w:t>
+        <w:t>McKinsey &amp; Company, 2024</w:t>
       </w:r>
     </w:p>
     <w:p>
@@ -1671,7 +1731,7 @@
           <w:color w:val="333333"/>
           <w:sz w:val="22"/>
         </w:rPr>
-        <w:t xml:space="preserve"> McKinsey estimates generative AI could create $5-7 billion in value for life sciences, with pharma R&amp;D representing 30-40% of that potential. The report emphasizes the industry is moving from experimentation to "purposeful transformation" where organizations must balance innovation with operational discipline. The piece suggests companies are now focusing on strategic implementation rather than proof-of-concept projects.</w:t>
+        <w:t xml:space="preserve"> McKinsey estimates generative AI could create $5-7 billion in value for life sciences, with R&amp;D capturing 30-40% of that potential. The report emphasizes that successful implementation requires "discipline and innovation" working together rather than technology adoption alone. They note the industry is moving from experimental pilots toward systematic integration, which demands different organizational capabilities.</w:t>
       </w:r>
     </w:p>
     <w:p>
@@ -1691,7 +1751,7 @@
           <w:color w:val="333333"/>
           <w:sz w:val="22"/>
         </w:rPr>
-        <w:t xml:space="preserve"> The shift from hype to strategic implementation means R&amp;D organizations need structured approaches to AI adoption. This isn't about technology deployment—it's about helping scientific teams understand how their work changes and ensuring transformation efforts focus on actual value creation rather than following trends.</w:t>
+        <w:t xml:space="preserve"> The tension between "discipline and innovation" directly relates to transformation challenges in R&amp;D organizations. Scientists often resist process changes that feel bureaucratic, while leadership demands measurable returns on AI investments. Understanding how to balance these competing pressures is central to successful transformation work.</w:t>
       </w:r>
     </w:p>
     <w:p>
@@ -1712,47 +1772,30 @@
       </w:pPr>
       <w:r>
         <w:rPr>
+          <w:color w:val="333333"/>
+          <w:sz w:val="22"/>
+        </w:rPr>
+        <w:t>### Rejected Articles</w:t>
+      </w:r>
+    </w:p>
+    <w:p>
+      <w:pPr>
+        <w:jc w:val="left"/>
+      </w:pPr>
+      <w:r>
+        <w:rPr>
           <w:b/>
           <w:color w:val="333333"/>
           <w:sz w:val="22"/>
         </w:rPr>
         <w:t>Generative AI to Reshape the Future of Life Sciences</w:t>
       </w:r>
-    </w:p>
-    <w:p>
-      <w:pPr>
-        <w:jc w:val="left"/>
-      </w:pPr>
       <w:r>
         <w:rPr>
           <w:color w:val="333333"/>
           <w:sz w:val="22"/>
         </w:rPr>
-        <w:t>*Author not specified*</w:t>
-      </w:r>
-    </w:p>
-    <w:p>
-      <w:pPr>
-        <w:jc w:val="left"/>
-      </w:pPr>
-      <w:r>
-        <w:rPr>
-          <w:color w:val="333333"/>
-          <w:sz w:val="22"/>
-        </w:rPr>
-        <w:t>Deloitte, 2025</w:t>
-      </w:r>
-    </w:p>
-    <w:p>
-      <w:pPr>
-        <w:jc w:val="left"/>
-      </w:pPr>
-      <w:r>
-        <w:rPr>
-          <w:color w:val="333333"/>
-          <w:sz w:val="22"/>
-        </w:rPr>
-        <w:t>https://www.deloitte.com/us/en/Industries/life-sciences-health-care/articles/value-of-genai-in-pharma.html</w:t>
+        <w:t xml:space="preserve"> (Deloitte) - Contains interesting statistics (30% of leaders cite agentic AI as important, only 22% have scaled AI successfully) but lacks depth on implementation challenges or organizational implications.</w:t>
       </w:r>
     </w:p>
     <w:p>
@@ -1765,34 +1808,26 @@
           <w:color w:val="333333"/>
           <w:sz w:val="22"/>
         </w:rPr>
-        <w:t>Key insights:</w:t>
+        <w:t>Reimagined: Learning &amp; development in the future of work</w:t>
       </w:r>
       <w:r>
         <w:rPr>
           <w:color w:val="333333"/>
           <w:sz w:val="22"/>
         </w:rPr>
-        <w:t xml:space="preserve"> Despite widespread enthusiasm (30% of leaders cite agentic AI as a key 2026 trend), actual implementation lags significantly—only 22% of organizations have scaled AI initiatives and just 9% report significant returns. The report highlights a gap between executive expectations and operational reality. The industry is beginning to focus on measurable productivity gains rather than experimental applications.</w:t>
+        <w:t xml:space="preserve"> (McKinsey) - Covers general workforce development trends with minimal connection to life sciences or specific insights about AI's impact on scientific work.</w:t>
       </w:r>
     </w:p>
     <w:p>
       <w:pPr>
         <w:jc w:val="left"/>
       </w:pPr>
-      <w:r>
-        <w:rPr>
-          <w:b/>
-          <w:color w:val="333333"/>
-          <w:sz w:val="22"/>
-        </w:rPr>
-        <w:t>Relevance to Plumtree:</w:t>
-      </w:r>
       <w:r>
         <w:rPr>
           <w:color w:val="333333"/>
           <w:sz w:val="22"/>
         </w:rPr>
-        <w:t xml:space="preserve"> The implementation gap reveals a classic transformation challenge: organizations know they need to adopt AI but struggle with execution. This suggests R&amp;D teams need support with practical implementation strategies, realistic timeline setting, and measuring actual impact rather than pursuing AI initiatives for their own sake.</w:t>
+        <w:t>### Assessment</w:t>
       </w:r>
     </w:p>
     <w:p>
@@ -1804,27 +1839,7 @@
           <w:color w:val="333333"/>
           <w:sz w:val="22"/>
         </w:rPr>
-        <w:t>---</w:t>
-      </w:r>
-    </w:p>
-    <w:p>
-      <w:pPr>
-        <w:jc w:val="left"/>
-      </w:pPr>
-      <w:r>
-        <w:rPr>
-          <w:b/>
-          <w:color w:val="333333"/>
-          <w:sz w:val="22"/>
-        </w:rPr>
-        <w:t>Assessment:</w:t>
-      </w:r>
-      <w:r>
-        <w:rPr>
-          <w:color w:val="333333"/>
-          <w:sz w:val="22"/>
-        </w:rPr>
-        <w:t xml:space="preserve"> This week provided solid, substantive coverage of AI in life sciences R&amp;D. The sources are credible and focus on practical implementation challenges rather than speculative trends. The fourth result on learning and development was too generic and brief to warrant inclusion.</w:t>
+        <w:t>This week's results are thin for substantive analysis of AI's impact on scientific work practices. Most sources focus on technology capabilities rather than organizational transformation challenges. The academic piece provides useful context on current AI applications, while the McKinsey report offers relevant insights about implementation realities, but deeper analysis of workforce implications remains limited.</w:t>
       </w:r>
     </w:p>
     <w:p/>
@@ -1862,7 +1877,7 @@
         <w:t>## The So What This Week</w:t>
         <w:br/>
         <w:br/>
-        <w:t>The research this week reveals a fundamental mismatch between how organizations are approaching AI transformation and what actually makes it work. While life sciences companies are investing heavily in AI tools—with McKinsey estimating $5-7 billion in potential value—only 22% have successfully scaled these initiatives and just 9% report meaningful returns. The gap isn't technical; it's human. The most compelling finding comes from Deloitte's research on high-performing teams, which shows that successful AI adoption happens when organizations focus on amplifying human capabilities like curiosity, resilience, and emotional intelligence rather than replacing human judgment. This creates a clear tension: executives are pursuing "agentic AI" and digital transformation while the evidence suggests they should be building the human capabilities that make AI partnerships effective. For R&amp;D organizations, this means transformation efforts need to start with how scientists actually collaborate and make decisions, not with the technology itself.</w:t>
+        <w:t>The research reveals a fundamental mismatch between AI ambition and organizational reality in life sciences. While 30% of leaders cite AI as transformational and McKinsey estimates billions in potential value, only 22% have successfully scaled AI initiatives and just 1 in 50 AI investments deliver meaningful returns. This gap isn't technical—it's human. The most compelling finding comes from Deloitte's team research: high-performing teams use AI more frequently than others, but they treat it as a complement to human capabilities like curiosity, resilience, and emotional intelligence rather than a replacement for them. Meanwhile, organizations are attempting wholesale transformations (26 of 30 major pharma companies have announced major restructuring) while struggling with basic collaboration patterns between humans and machines. The disconnect suggests that R&amp;D leaders are solving the wrong problem—focusing on AI deployment rather than building the human capabilities that make AI integration actually work.</w:t>
       </w:r>
     </w:p>
     <w:sectPr>

</xml_diff>